<commit_message>
docs: Growth Doctor — bot+dashboard integration, build-status, xlsx sheet+master
</commit_message>
<xml_diff>
--- a/PRODUCTS/07-growth-doctor.docx
+++ b/PRODUCTS/07-growth-doctor.docx
@@ -163,13 +163,115 @@
       <w:r>
         <w:rPr>
           <w:rFonts w:ascii="Arial" w:hAnsi="Arial"/>
+          <w:b/>
+          <w:i/>
+          <w:sz w:val="22"/>
+          <w:rtl w:val="1"/>
+          <w:rFonts w:cs="Arial"/>
+        </w:rPr>
+        <w:t>גישה מרובת-ערוצים:</w:t>
+      </w:r>
+      <w:r>
+        <w:rPr>
+          <w:rFonts w:ascii="Arial" w:hAnsi="Arial"/>
           <w:b w:val="0"/>
           <w:i/>
           <w:sz w:val="22"/>
           <w:rtl w:val="1"/>
           <w:rFonts w:cs="Arial"/>
         </w:rPr>
-        <w:t>נגזר מדיון-שוק אמיתי (יזמים, 2026-07): ROI מקסימלי = לשפר את מי שכבר מגיע, לא לקנות עוד תנועה. תאריך: 2026-07-22 · סטטוס: אפיון.</w:t>
+        <w:t xml:space="preserve"> דשבורד web + </w:t>
+      </w:r>
+      <w:r>
+        <w:rPr>
+          <w:rFonts w:ascii="Arial" w:hAnsi="Arial"/>
+          <w:b/>
+          <w:i/>
+          <w:sz w:val="22"/>
+          <w:rtl w:val="1"/>
+          <w:rFonts w:cs="Arial"/>
+        </w:rPr>
+        <w:t>בוט וואטסאפ/טלגרם/מייל</w:t>
+      </w:r>
+      <w:r>
+        <w:rPr>
+          <w:rFonts w:ascii="Arial" w:hAnsi="Arial"/>
+          <w:b w:val="0"/>
+          <w:i/>
+          <w:sz w:val="22"/>
+          <w:rtl w:val="1"/>
+          <w:rFonts w:cs="Arial"/>
+        </w:rPr>
+        <w:t xml:space="preserve"> (כל פונקציה נגישה מהבוט) · </w:t>
+      </w:r>
+      <w:r>
+        <w:rPr>
+          <w:rFonts w:ascii="Arial" w:hAnsi="Arial"/>
+          <w:b/>
+          <w:i/>
+          <w:sz w:val="22"/>
+          <w:rtl w:val="1"/>
+          <w:rFonts w:cs="Arial"/>
+        </w:rPr>
+        <w:t>מחובר ל-HELIX DASHBOARDS</w:t>
+      </w:r>
+      <w:r>
+        <w:rPr>
+          <w:rFonts w:ascii="Arial" w:hAnsi="Arial"/>
+          <w:b w:val="0"/>
+          <w:i/>
+          <w:sz w:val="22"/>
+          <w:rtl w:val="1"/>
+          <w:rFonts w:cs="Arial"/>
+        </w:rPr>
+        <w:t xml:space="preserve"> + לשאר מוצרי HELIX (Landing/A-B/Campaigns/Churn-Radar).</w:t>
+      </w:r>
+    </w:p>
+    <w:p>
+      <w:pPr>
+        <w:bidi w:val="1"/>
+        <w:ind w:left="360"/>
+        <w:jc w:val="right"/>
+      </w:pPr>
+      <w:r>
+        <w:rPr>
+          <w:rFonts w:ascii="Arial" w:hAnsi="Arial"/>
+          <w:b/>
+          <w:i/>
+          <w:sz w:val="22"/>
+          <w:rtl w:val="1"/>
+          <w:rFonts w:cs="Arial"/>
+        </w:rPr>
+        <w:t>מודל דואלי:</w:t>
+      </w:r>
+      <w:r>
+        <w:rPr>
+          <w:rFonts w:ascii="Arial" w:hAnsi="Arial"/>
+          <w:b w:val="0"/>
+          <w:i/>
+          <w:sz w:val="22"/>
+          <w:rtl w:val="1"/>
+          <w:rFonts w:cs="Arial"/>
+        </w:rPr>
+        <w:t xml:space="preserve"> מכירה ישירה תחת מותג HELIX (ערוץ ראשי) + הפצה/שת"פ white-label דרך שותף (אופציונלי). מנוף Ollama מוזיל עלות.</w:t>
+      </w:r>
+    </w:p>
+    <w:p>
+      <w:pPr>
+        <w:bidi w:val="1"/>
+        <w:ind w:left="360"/>
+        <w:jc w:val="right"/>
+      </w:pPr>
+      <w:r>
+        <w:rPr>
+          <w:rFonts w:ascii="Arial" w:hAnsi="Arial"/>
+          <w:b w:val="0"/>
+          <w:i/>
+          <w:sz w:val="22"/>
+          <w:rtl w:val="1"/>
+          <w:rFonts w:cs="Arial"/>
+        </w:rPr>
+        <w:t>נגזר מדיון-שוק אמיתי (יזמים, 2026-07): ROI מקסימלי = לשפר את מי שכבר מגיע, לא לקנות עוד תנועה. תאריך: 2026-07-22 · סטטוס: אפיון (טרם בנייה — ממתין לגיט).</w:t>
       </w:r>
     </w:p>
     <w:p>
@@ -2246,6 +2348,303 @@
           <w:rFonts w:cs="Arial"/>
         </w:rPr>
         <w:t xml:space="preserve"> — התובנה+הפעולה כ-digest בבוט (וואטסאפ/טלגרם).</w:t>
+      </w:r>
+    </w:p>
+    <w:p>
+      <w:pPr>
+        <w:pStyle w:val="Heading2"/>
+        <w:bidi w:val="1"/>
+        <w:jc w:val="right"/>
+      </w:pPr>
+      <w:r>
+        <w:rPr>
+          <w:rFonts w:ascii="Arial" w:hAnsi="Arial"/>
+          <w:b w:val="0"/>
+          <w:sz w:val="28"/>
+          <w:rtl w:val="1"/>
+          <w:rFonts w:cs="Arial"/>
+        </w:rPr>
+        <w:t>3.5 גישה מרובת-ערוצים (בוט) + חיבור לאקו-סיסטם 🔀</w:t>
+      </w:r>
+    </w:p>
+    <w:p>
+      <w:pPr>
+        <w:bidi w:val="1"/>
+        <w:jc w:val="right"/>
+      </w:pPr>
+      <w:r>
+        <w:rPr>
+          <w:rFonts w:ascii="Arial" w:hAnsi="Arial"/>
+          <w:b/>
+          <w:sz w:val="22"/>
+          <w:rtl w:val="1"/>
+          <w:rFonts w:cs="Arial"/>
+        </w:rPr>
+        <w:t>כמו כל מוצרי HELIX — כל פונקציה נגישה גם מהבוט, וכל המדדים זורמים לדשבורד-העל.</w:t>
+      </w:r>
+    </w:p>
+    <w:p>
+      <w:pPr>
+        <w:pStyle w:val="ListBullet"/>
+        <w:bidi w:val="1"/>
+        <w:jc w:val="right"/>
+      </w:pPr>
+      <w:r>
+        <w:rPr>
+          <w:rFonts w:ascii="Arial" w:hAnsi="Arial"/>
+          <w:b/>
+          <w:sz w:val="22"/>
+          <w:rtl w:val="1"/>
+          <w:rFonts w:cs="Arial"/>
+        </w:rPr>
+        <w:t>בוט (וואטסאפ/טלגרם/מייל):</w:t>
+      </w:r>
+      <w:r>
+        <w:rPr>
+          <w:rFonts w:ascii="Arial" w:hAnsi="Arial"/>
+          <w:b w:val="0"/>
+          <w:sz w:val="22"/>
+          <w:rtl w:val="1"/>
+          <w:rFonts w:cs="Arial"/>
+        </w:rPr>
+        <w:t xml:space="preserve"> לא רק דייג'סט יוצא — גם </w:t>
+      </w:r>
+      <w:r>
+        <w:rPr>
+          <w:rFonts w:ascii="Arial" w:hAnsi="Arial"/>
+          <w:b/>
+          <w:sz w:val="22"/>
+          <w:rtl w:val="1"/>
+          <w:rFonts w:cs="Arial"/>
+        </w:rPr>
+        <w:t>נכנס</w:t>
+      </w:r>
+      <w:r>
+        <w:rPr>
+          <w:rFonts w:ascii="Arial" w:hAnsi="Arial"/>
+          <w:b w:val="0"/>
+          <w:sz w:val="22"/>
+          <w:rtl w:val="1"/>
+          <w:rFonts w:cs="Arial"/>
+        </w:rPr>
+        <w:t xml:space="preserve">: "מה הכי דולף החודש?" / "שלח win-back לנושרים" / "תקן את הצ׳קאאוט" → הסוכן מבצע. webhook מאוחד </w:t>
+      </w:r>
+      <w:r>
+        <w:rPr>
+          <w:rFonts w:ascii="Consolas" w:hAnsi="Consolas"/>
+          <w:b w:val="0"/>
+          <w:color w:val="B02A37"/>
+          <w:sz w:val="22"/>
+          <w:rtl w:val="1"/>
+          <w:rFonts w:cs="Consolas"/>
+        </w:rPr>
+        <w:t>/api/bot</w:t>
+      </w:r>
+      <w:r>
+        <w:rPr>
+          <w:rFonts w:ascii="Arial" w:hAnsi="Arial"/>
+          <w:b w:val="0"/>
+          <w:sz w:val="22"/>
+          <w:rtl w:val="1"/>
+          <w:rFonts w:cs="Arial"/>
+        </w:rPr>
+        <w:t xml:space="preserve"> + router (מודל HELIX OPS).</w:t>
+      </w:r>
+    </w:p>
+    <w:p>
+      <w:pPr>
+        <w:pStyle w:val="ListBullet"/>
+        <w:bidi w:val="1"/>
+        <w:jc w:val="right"/>
+      </w:pPr>
+      <w:r>
+        <w:rPr>
+          <w:rFonts w:ascii="Arial" w:hAnsi="Arial"/>
+          <w:b/>
+          <w:sz w:val="22"/>
+          <w:rtl w:val="1"/>
+          <w:rFonts w:cs="Arial"/>
+        </w:rPr>
+        <w:t>חיבור ל-HELIX DASHBOARDS:</w:t>
+      </w:r>
+      <w:r>
+        <w:rPr>
+          <w:rFonts w:ascii="Arial" w:hAnsi="Arial"/>
+          <w:b w:val="0"/>
+          <w:sz w:val="22"/>
+          <w:rtl w:val="1"/>
+          <w:rFonts w:cs="Arial"/>
+        </w:rPr>
+        <w:t xml:space="preserve"> endpoint ייצוא (</w:t>
+      </w:r>
+      <w:r>
+        <w:rPr>
+          <w:rFonts w:ascii="Consolas" w:hAnsi="Consolas"/>
+          <w:b w:val="0"/>
+          <w:color w:val="B02A37"/>
+          <w:sz w:val="22"/>
+          <w:rtl w:val="1"/>
+          <w:rFonts w:cs="Consolas"/>
+        </w:rPr>
+        <w:t>/api/export/growth-metrics</w:t>
+      </w:r>
+      <w:r>
+        <w:rPr>
+          <w:rFonts w:ascii="Arial" w:hAnsi="Arial"/>
+          <w:b w:val="0"/>
+          <w:sz w:val="22"/>
+          <w:rtl w:val="1"/>
+          <w:rFonts w:cs="Arial"/>
+        </w:rPr>
+        <w:t xml:space="preserve">) → connector </w:t>
+      </w:r>
+      <w:r>
+        <w:rPr>
+          <w:rFonts w:ascii="Consolas" w:hAnsi="Consolas"/>
+          <w:b w:val="0"/>
+          <w:color w:val="B02A37"/>
+          <w:sz w:val="22"/>
+          <w:rtl w:val="1"/>
+          <w:rFonts w:cs="Consolas"/>
+        </w:rPr>
+        <w:t>helix_growth</w:t>
+      </w:r>
+      <w:r>
+        <w:rPr>
+          <w:rFonts w:ascii="Arial" w:hAnsi="Arial"/>
+          <w:b w:val="0"/>
+          <w:sz w:val="22"/>
+          <w:rtl w:val="1"/>
+          <w:rFonts w:cs="Arial"/>
+        </w:rPr>
+        <w:t xml:space="preserve"> בדשבורדים → </w:t>
+      </w:r>
+      <w:r>
+        <w:rPr>
+          <w:rFonts w:ascii="Arial" w:hAnsi="Arial"/>
+          <w:b/>
+          <w:sz w:val="22"/>
+          <w:rtl w:val="1"/>
+          <w:rFonts w:cs="Arial"/>
+        </w:rPr>
+        <w:t>A/B, funnel drop-off, retention, churn נראים בדשבורד ההנהלה</w:t>
+      </w:r>
+      <w:r>
+        <w:rPr>
+          <w:rFonts w:ascii="Arial" w:hAnsi="Arial"/>
+          <w:b w:val="0"/>
+          <w:sz w:val="22"/>
+          <w:rtl w:val="1"/>
+          <w:rFonts w:cs="Arial"/>
+        </w:rPr>
+        <w:t xml:space="preserve"> (לצד שאר המוצרים).</w:t>
+      </w:r>
+    </w:p>
+    <w:p>
+      <w:pPr>
+        <w:pStyle w:val="ListBullet"/>
+        <w:bidi w:val="1"/>
+        <w:jc w:val="right"/>
+      </w:pPr>
+      <w:r>
+        <w:rPr>
+          <w:rFonts w:ascii="Arial" w:hAnsi="Arial"/>
+          <w:b/>
+          <w:sz w:val="22"/>
+          <w:rtl w:val="1"/>
+          <w:rFonts w:cs="Arial"/>
+        </w:rPr>
+        <w:t>חיבור לשאר מוצרי HELIX (פעולה):</w:t>
+      </w:r>
+      <w:r>
+        <w:rPr>
+          <w:rFonts w:ascii="Arial" w:hAnsi="Arial"/>
+          <w:b w:val="0"/>
+          <w:sz w:val="22"/>
+          <w:rtl w:val="1"/>
+          <w:rFonts w:cs="Arial"/>
+        </w:rPr>
+        <w:t xml:space="preserve"> התיקון מבוצע דרך המנועים הקיימים — </w:t>
+      </w:r>
+      <w:r>
+        <w:rPr>
+          <w:rFonts w:ascii="Arial" w:hAnsi="Arial"/>
+          <w:b/>
+          <w:sz w:val="22"/>
+          <w:rtl w:val="1"/>
+          <w:rFonts w:cs="Arial"/>
+        </w:rPr>
+        <w:t>Landing</w:t>
+      </w:r>
+      <w:r>
+        <w:rPr>
+          <w:rFonts w:ascii="Arial" w:hAnsi="Arial"/>
+          <w:b w:val="0"/>
+          <w:sz w:val="22"/>
+          <w:rtl w:val="1"/>
+          <w:rFonts w:cs="Arial"/>
+        </w:rPr>
+        <w:t xml:space="preserve"> (מוצר 1 §2.9), </w:t>
+      </w:r>
+      <w:r>
+        <w:rPr>
+          <w:rFonts w:ascii="Arial" w:hAnsi="Arial"/>
+          <w:b/>
+          <w:sz w:val="22"/>
+          <w:rtl w:val="1"/>
+          <w:rFonts w:cs="Arial"/>
+        </w:rPr>
+        <w:t>A/B</w:t>
+      </w:r>
+      <w:r>
+        <w:rPr>
+          <w:rFonts w:ascii="Arial" w:hAnsi="Arial"/>
+          <w:b w:val="0"/>
+          <w:sz w:val="22"/>
+          <w:rtl w:val="1"/>
+          <w:rFonts w:cs="Arial"/>
+        </w:rPr>
+        <w:t xml:space="preserve"> (מוצר 1 §2.8), </w:t>
+      </w:r>
+      <w:r>
+        <w:rPr>
+          <w:rFonts w:ascii="Arial" w:hAnsi="Arial"/>
+          <w:b/>
+          <w:sz w:val="22"/>
+          <w:rtl w:val="1"/>
+          <w:rFonts w:cs="Arial"/>
+        </w:rPr>
+        <w:t>Campaigns/win-back</w:t>
+      </w:r>
+      <w:r>
+        <w:rPr>
+          <w:rFonts w:ascii="Arial" w:hAnsi="Arial"/>
+          <w:b w:val="0"/>
+          <w:sz w:val="22"/>
+          <w:rtl w:val="1"/>
+          <w:rFonts w:cs="Arial"/>
+        </w:rPr>
+        <w:t xml:space="preserve"> (מוצר 1), </w:t>
+      </w:r>
+      <w:r>
+        <w:rPr>
+          <w:rFonts w:ascii="Arial" w:hAnsi="Arial"/>
+          <w:b/>
+          <w:sz w:val="22"/>
+          <w:rtl w:val="1"/>
+          <w:rFonts w:cs="Arial"/>
+        </w:rPr>
+        <w:t>Churn Radar</w:t>
+      </w:r>
+      <w:r>
+        <w:rPr>
+          <w:rFonts w:ascii="Arial" w:hAnsi="Arial"/>
+          <w:b w:val="0"/>
+          <w:sz w:val="22"/>
+          <w:rtl w:val="1"/>
+          <w:rFonts w:cs="Arial"/>
+        </w:rPr>
+        <w:t xml:space="preserve"> (מוצר 6). Growth Doctor = שכבת-האבחון שמתזמרת אותם.</w:t>
       </w:r>
     </w:p>
     <w:p>
@@ -5765,6 +6164,1307 @@
     </w:p>
     <w:p>
       <w:pPr>
+        <w:pStyle w:val="Heading2"/>
+        <w:bidi w:val="1"/>
+        <w:jc w:val="right"/>
+      </w:pPr>
+      <w:r>
+        <w:rPr>
+          <w:rFonts w:ascii="Arial" w:hAnsi="Arial"/>
+          <w:b w:val="0"/>
+          <w:sz w:val="28"/>
+          <w:rtl w:val="1"/>
+          <w:rFonts w:cs="Arial"/>
+        </w:rPr>
+        <w:t>11. סטטוס בנייה 🏗️</w:t>
+      </w:r>
+    </w:p>
+    <w:p>
+      <w:pPr>
+        <w:bidi w:val="1"/>
+        <w:ind w:left="360"/>
+        <w:jc w:val="right"/>
+      </w:pPr>
+      <w:r>
+        <w:rPr>
+          <w:rFonts w:ascii="Arial" w:hAnsi="Arial"/>
+          <w:b/>
+          <w:i/>
+          <w:sz w:val="22"/>
+          <w:rtl w:val="1"/>
+          <w:rFonts w:cs="Arial"/>
+        </w:rPr>
+        <w:t>סטטוס: אפיון מלא — טרם בנייה בקוד.</w:t>
+      </w:r>
+      <w:r>
+        <w:rPr>
+          <w:rFonts w:ascii="Arial" w:hAnsi="Arial"/>
+          <w:b w:val="0"/>
+          <w:i/>
+          <w:sz w:val="22"/>
+          <w:rtl w:val="1"/>
+          <w:rFonts w:cs="Arial"/>
+        </w:rPr>
+        <w:t xml:space="preserve"> (ממתין לגיט ייעודי שהמשתמש פותח.)</w:t>
+      </w:r>
+    </w:p>
+    <w:p>
+      <w:pPr>
+        <w:pStyle w:val="Heading3"/>
+        <w:bidi w:val="1"/>
+        <w:jc w:val="right"/>
+      </w:pPr>
+      <w:r>
+        <w:rPr>
+          <w:rFonts w:ascii="Arial" w:hAnsi="Arial"/>
+          <w:b w:val="0"/>
+          <w:sz w:val="24"/>
+          <w:rtl w:val="1"/>
+          <w:rFonts w:cs="Arial"/>
+        </w:rPr>
+        <w:t>✅ מה נעשה</w:t>
+      </w:r>
+    </w:p>
+    <w:p>
+      <w:pPr>
+        <w:pStyle w:val="ListBullet"/>
+        <w:bidi w:val="1"/>
+        <w:jc w:val="right"/>
+      </w:pPr>
+      <w:r>
+        <w:rPr>
+          <w:rFonts w:ascii="Arial" w:hAnsi="Arial"/>
+          <w:b/>
+          <w:sz w:val="22"/>
+          <w:rtl w:val="1"/>
+          <w:rFonts w:cs="Arial"/>
+        </w:rPr>
+        <w:t>מפרט מלא</w:t>
+      </w:r>
+      <w:r>
+        <w:rPr>
+          <w:rFonts w:ascii="Arial" w:hAnsi="Arial"/>
+          <w:b w:val="0"/>
+          <w:sz w:val="22"/>
+          <w:rtl w:val="1"/>
+          <w:rFonts w:cs="Arial"/>
+        </w:rPr>
+        <w:t xml:space="preserve"> (המסמך הזה) — 2 צירים, כל הפיצ'רים, מטריצת-מתחרים, פרטיות, מקורות-נתונים, מסכים, מונטיזציה, סדר-בנייה.</w:t>
+      </w:r>
+    </w:p>
+    <w:p>
+      <w:pPr>
+        <w:pStyle w:val="ListBullet"/>
+        <w:bidi w:val="1"/>
+        <w:jc w:val="right"/>
+      </w:pPr>
+      <w:r>
+        <w:rPr>
+          <w:rFonts w:ascii="Arial" w:hAnsi="Arial"/>
+          <w:b/>
+          <w:sz w:val="22"/>
+          <w:rtl w:val="1"/>
+          <w:rFonts w:cs="Arial"/>
+        </w:rPr>
+        <w:t>Artifact ויזואלי</w:t>
+      </w:r>
+      <w:r>
+        <w:rPr>
+          <w:rFonts w:ascii="Arial" w:hAnsi="Arial"/>
+          <w:b w:val="0"/>
+          <w:sz w:val="22"/>
+          <w:rtl w:val="1"/>
+          <w:rFonts w:cs="Arial"/>
+        </w:rPr>
+        <w:t xml:space="preserve"> — הדגמה חיה: page-heatmap · funnel drop-off · cohort retention heatmap · כרטיסי-אבחון · מטריצת-מתחרים · דייג'סט-בוט.</w:t>
+      </w:r>
+    </w:p>
+    <w:p>
+      <w:pPr>
+        <w:pStyle w:val="ListBullet"/>
+        <w:bidi w:val="1"/>
+        <w:jc w:val="right"/>
+      </w:pPr>
+      <w:r>
+        <w:rPr>
+          <w:rFonts w:ascii="Arial" w:hAnsi="Arial"/>
+          <w:b/>
+          <w:sz w:val="22"/>
+          <w:rtl w:val="1"/>
+          <w:rFonts w:cs="Arial"/>
+        </w:rPr>
+        <w:t>מיפוי שימוש-חוזר</w:t>
+      </w:r>
+      <w:r>
+        <w:rPr>
+          <w:rFonts w:ascii="Arial" w:hAnsi="Arial"/>
+          <w:b w:val="0"/>
+          <w:sz w:val="22"/>
+          <w:rtl w:val="1"/>
+          <w:rFonts w:cs="Arial"/>
+        </w:rPr>
+        <w:t xml:space="preserve"> — ~80% מהתשתית כבר קיימת (Landing/A-B/Campaigns/attribution/Churn-Radar/Ollama/בוט/דשבורדים).</w:t>
+      </w:r>
+    </w:p>
+    <w:p>
+      <w:pPr>
+        <w:pStyle w:val="Heading3"/>
+        <w:bidi w:val="1"/>
+        <w:jc w:val="right"/>
+      </w:pPr>
+      <w:r>
+        <w:rPr>
+          <w:rFonts w:ascii="Arial" w:hAnsi="Arial"/>
+          <w:b w:val="0"/>
+          <w:sz w:val="24"/>
+          <w:rtl w:val="1"/>
+          <w:rFonts w:cs="Arial"/>
+        </w:rPr>
+        <w:t>⬜ מה נשאר להשלים (הכל — לפי סדר-הבנייה §10)</w:t>
+      </w:r>
+    </w:p>
+    <w:tbl>
+      <w:tblPr>
+        <w:tblStyle w:val="LightGrid-Accent1"/>
+        <w:tblW w:type="auto" w:w="0"/>
+        <w:tblLook w:firstColumn="1" w:firstRow="1" w:lastColumn="0" w:lastRow="0" w:noHBand="0" w:noVBand="1" w:val="04A0"/>
+        <w:bidiVisual/>
+      </w:tblPr>
+      <w:tblGrid>
+        <w:gridCol w:w="2160"/>
+        <w:gridCol w:w="2160"/>
+        <w:gridCol w:w="2160"/>
+        <w:gridCol w:w="2160"/>
+      </w:tblGrid>
+      <w:tr>
+        <w:tc>
+          <w:tcPr>
+            <w:tcW w:type="dxa" w:w="2160"/>
+          </w:tcPr>
+          <w:p>
+            <w:pPr>
+              <w:bidi w:val="1"/>
+              <w:jc w:val="right"/>
+            </w:pPr>
+            <w:r>
+              <w:rPr>
+                <w:rFonts w:ascii="Arial" w:hAnsi="Arial"/>
+                <w:b/>
+                <w:sz w:val="20"/>
+                <w:rtl w:val="1"/>
+                <w:rFonts w:cs="Arial"/>
+              </w:rPr>
+              <w:t>#</w:t>
+            </w:r>
+          </w:p>
+        </w:tc>
+        <w:tc>
+          <w:tcPr>
+            <w:tcW w:type="dxa" w:w="2160"/>
+          </w:tcPr>
+          <w:p>
+            <w:pPr>
+              <w:bidi w:val="1"/>
+              <w:jc w:val="right"/>
+            </w:pPr>
+            <w:r>
+              <w:rPr>
+                <w:rFonts w:ascii="Arial" w:hAnsi="Arial"/>
+                <w:b/>
+                <w:sz w:val="20"/>
+                <w:rtl w:val="1"/>
+                <w:rFonts w:cs="Arial"/>
+              </w:rPr>
+              <w:t>מה</w:t>
+            </w:r>
+          </w:p>
+        </w:tc>
+        <w:tc>
+          <w:tcPr>
+            <w:tcW w:type="dxa" w:w="2160"/>
+          </w:tcPr>
+          <w:p>
+            <w:pPr>
+              <w:bidi w:val="1"/>
+              <w:jc w:val="right"/>
+            </w:pPr>
+            <w:r>
+              <w:rPr>
+                <w:rFonts w:ascii="Arial" w:hAnsi="Arial"/>
+                <w:b/>
+                <w:sz w:val="20"/>
+                <w:rtl w:val="1"/>
+                <w:rFonts w:cs="Arial"/>
+              </w:rPr>
+              <w:t>סטטוס</w:t>
+            </w:r>
+          </w:p>
+        </w:tc>
+        <w:tc>
+          <w:tcPr>
+            <w:tcW w:type="dxa" w:w="2160"/>
+          </w:tcPr>
+          <w:p>
+            <w:pPr>
+              <w:bidi w:val="1"/>
+              <w:jc w:val="right"/>
+            </w:pPr>
+            <w:r>
+              <w:rPr>
+                <w:rFonts w:ascii="Arial" w:hAnsi="Arial"/>
+                <w:b/>
+                <w:sz w:val="20"/>
+                <w:rtl w:val="1"/>
+                <w:rFonts w:cs="Arial"/>
+              </w:rPr>
+              <w:t>מה צריך</w:t>
+            </w:r>
+          </w:p>
+        </w:tc>
+      </w:tr>
+      <w:tr>
+        <w:tc>
+          <w:tcPr>
+            <w:tcW w:type="dxa" w:w="2160"/>
+          </w:tcPr>
+          <w:p>
+            <w:pPr>
+              <w:bidi w:val="1"/>
+              <w:jc w:val="right"/>
+            </w:pPr>
+            <w:r>
+              <w:rPr>
+                <w:rFonts w:ascii="Arial" w:hAnsi="Arial"/>
+                <w:b w:val="0"/>
+                <w:sz w:val="20"/>
+                <w:rtl w:val="1"/>
+                <w:rFonts w:cs="Arial"/>
+              </w:rPr>
+              <w:t>1</w:t>
+            </w:r>
+          </w:p>
+        </w:tc>
+        <w:tc>
+          <w:tcPr>
+            <w:tcW w:type="dxa" w:w="2160"/>
+          </w:tcPr>
+          <w:p>
+            <w:pPr>
+              <w:bidi w:val="1"/>
+              <w:jc w:val="right"/>
+            </w:pPr>
+            <w:r>
+              <w:rPr>
+                <w:rFonts w:ascii="Arial" w:hAnsi="Arial"/>
+                <w:b/>
+                <w:sz w:val="20"/>
+                <w:rtl w:val="1"/>
+                <w:rFonts w:cs="Arial"/>
+              </w:rPr>
+              <w:t>סקאפולד אפליקציה</w:t>
+            </w:r>
+          </w:p>
+        </w:tc>
+        <w:tc>
+          <w:tcPr>
+            <w:tcW w:type="dxa" w:w="2160"/>
+          </w:tcPr>
+          <w:p>
+            <w:pPr>
+              <w:bidi w:val="1"/>
+              <w:jc w:val="right"/>
+            </w:pPr>
+            <w:r>
+              <w:rPr>
+                <w:rFonts w:ascii="Arial" w:hAnsi="Arial"/>
+                <w:b w:val="0"/>
+                <w:sz w:val="20"/>
+                <w:rtl w:val="1"/>
+                <w:rFonts w:cs="Arial"/>
+              </w:rPr>
+              <w:t>טרם</w:t>
+            </w:r>
+          </w:p>
+        </w:tc>
+        <w:tc>
+          <w:tcPr>
+            <w:tcW w:type="dxa" w:w="2160"/>
+          </w:tcPr>
+          <w:p>
+            <w:pPr>
+              <w:bidi w:val="1"/>
+              <w:jc w:val="right"/>
+            </w:pPr>
+            <w:r>
+              <w:rPr>
+                <w:rFonts w:ascii="Arial" w:hAnsi="Arial"/>
+                <w:b w:val="0"/>
+                <w:sz w:val="20"/>
+                <w:rtl w:val="1"/>
+                <w:rFonts w:cs="Arial"/>
+              </w:rPr>
+              <w:t>Next.js 15 + TS + Tailwind + Supabase (RTL) בגיט הייעודי (בהמשך)</w:t>
+            </w:r>
+          </w:p>
+        </w:tc>
+      </w:tr>
+      <w:tr>
+        <w:tc>
+          <w:tcPr>
+            <w:tcW w:type="dxa" w:w="2160"/>
+          </w:tcPr>
+          <w:p>
+            <w:pPr>
+              <w:bidi w:val="1"/>
+              <w:jc w:val="right"/>
+            </w:pPr>
+            <w:r>
+              <w:rPr>
+                <w:rFonts w:ascii="Arial" w:hAnsi="Arial"/>
+                <w:b w:val="0"/>
+                <w:sz w:val="20"/>
+                <w:rtl w:val="1"/>
+                <w:rFonts w:cs="Arial"/>
+              </w:rPr>
+              <w:t>2</w:t>
+            </w:r>
+          </w:p>
+        </w:tc>
+        <w:tc>
+          <w:tcPr>
+            <w:tcW w:type="dxa" w:w="2160"/>
+          </w:tcPr>
+          <w:p>
+            <w:pPr>
+              <w:bidi w:val="1"/>
+              <w:jc w:val="right"/>
+            </w:pPr>
+            <w:r>
+              <w:rPr>
+                <w:rFonts w:ascii="Arial" w:hAnsi="Arial"/>
+                <w:b/>
+                <w:sz w:val="20"/>
+                <w:rtl w:val="1"/>
+                <w:rFonts w:cs="Arial"/>
+              </w:rPr>
+              <w:t>טאג-אירועים (HELIX tag)</w:t>
+            </w:r>
+          </w:p>
+        </w:tc>
+        <w:tc>
+          <w:tcPr>
+            <w:tcW w:type="dxa" w:w="2160"/>
+          </w:tcPr>
+          <w:p>
+            <w:pPr>
+              <w:bidi w:val="1"/>
+              <w:jc w:val="right"/>
+            </w:pPr>
+            <w:r>
+              <w:rPr>
+                <w:rFonts w:ascii="Arial" w:hAnsi="Arial"/>
+                <w:b w:val="0"/>
+                <w:sz w:val="20"/>
+                <w:rtl w:val="1"/>
+                <w:rFonts w:cs="Arial"/>
+              </w:rPr>
+              <w:t>טרם</w:t>
+            </w:r>
+          </w:p>
+        </w:tc>
+        <w:tc>
+          <w:tcPr>
+            <w:tcW w:type="dxa" w:w="2160"/>
+          </w:tcPr>
+          <w:p>
+            <w:pPr>
+              <w:bidi w:val="1"/>
+              <w:jc w:val="right"/>
+            </w:pPr>
+            <w:r>
+              <w:rPr>
+                <w:rFonts w:ascii="Arial" w:hAnsi="Arial"/>
+                <w:b w:val="0"/>
+                <w:sz w:val="20"/>
+                <w:rtl w:val="1"/>
+                <w:rFonts w:cs="Arial"/>
+              </w:rPr>
+              <w:t>snippet JS לאיסוף funnel-events + חזרות (first-party)</w:t>
+            </w:r>
+          </w:p>
+        </w:tc>
+      </w:tr>
+      <w:tr>
+        <w:tc>
+          <w:tcPr>
+            <w:tcW w:type="dxa" w:w="2160"/>
+          </w:tcPr>
+          <w:p>
+            <w:pPr>
+              <w:bidi w:val="1"/>
+              <w:jc w:val="right"/>
+            </w:pPr>
+            <w:r>
+              <w:rPr>
+                <w:rFonts w:ascii="Arial" w:hAnsi="Arial"/>
+                <w:b w:val="0"/>
+                <w:sz w:val="20"/>
+                <w:rtl w:val="1"/>
+                <w:rFonts w:cs="Arial"/>
+              </w:rPr>
+              <w:t>3</w:t>
+            </w:r>
+          </w:p>
+        </w:tc>
+        <w:tc>
+          <w:tcPr>
+            <w:tcW w:type="dxa" w:w="2160"/>
+          </w:tcPr>
+          <w:p>
+            <w:pPr>
+              <w:bidi w:val="1"/>
+              <w:jc w:val="right"/>
+            </w:pPr>
+            <w:r>
+              <w:rPr>
+                <w:rFonts w:ascii="Arial" w:hAnsi="Arial"/>
+                <w:b/>
+                <w:sz w:val="20"/>
+                <w:rtl w:val="1"/>
+                <w:rFonts w:cs="Arial"/>
+              </w:rPr>
+              <w:t>connector Microsoft Clarity</w:t>
+            </w:r>
+          </w:p>
+        </w:tc>
+        <w:tc>
+          <w:tcPr>
+            <w:tcW w:type="dxa" w:w="2160"/>
+          </w:tcPr>
+          <w:p>
+            <w:pPr>
+              <w:bidi w:val="1"/>
+              <w:jc w:val="right"/>
+            </w:pPr>
+            <w:r>
+              <w:rPr>
+                <w:rFonts w:ascii="Arial" w:hAnsi="Arial"/>
+                <w:b w:val="0"/>
+                <w:sz w:val="20"/>
+                <w:rtl w:val="1"/>
+                <w:rFonts w:cs="Arial"/>
+              </w:rPr>
+              <w:t>טרם</w:t>
+            </w:r>
+          </w:p>
+        </w:tc>
+        <w:tc>
+          <w:tcPr>
+            <w:tcW w:type="dxa" w:w="2160"/>
+          </w:tcPr>
+          <w:p>
+            <w:pPr>
+              <w:bidi w:val="1"/>
+              <w:jc w:val="right"/>
+            </w:pPr>
+            <w:r>
+              <w:rPr>
+                <w:rFonts w:ascii="Arial" w:hAnsi="Arial"/>
+                <w:b w:val="0"/>
+                <w:sz w:val="20"/>
+                <w:rtl w:val="1"/>
+                <w:rFonts w:cs="Arial"/>
+              </w:rPr>
+              <w:t>Clarity API (heatmaps/replay/funnels) — מקור חינם</w:t>
+            </w:r>
+          </w:p>
+        </w:tc>
+      </w:tr>
+      <w:tr>
+        <w:tc>
+          <w:tcPr>
+            <w:tcW w:type="dxa" w:w="2160"/>
+          </w:tcPr>
+          <w:p>
+            <w:pPr>
+              <w:bidi w:val="1"/>
+              <w:jc w:val="right"/>
+            </w:pPr>
+            <w:r>
+              <w:rPr>
+                <w:rFonts w:ascii="Arial" w:hAnsi="Arial"/>
+                <w:b w:val="0"/>
+                <w:sz w:val="20"/>
+                <w:rtl w:val="1"/>
+                <w:rFonts w:cs="Arial"/>
+              </w:rPr>
+              <w:t>4</w:t>
+            </w:r>
+          </w:p>
+        </w:tc>
+        <w:tc>
+          <w:tcPr>
+            <w:tcW w:type="dxa" w:w="2160"/>
+          </w:tcPr>
+          <w:p>
+            <w:pPr>
+              <w:bidi w:val="1"/>
+              <w:jc w:val="right"/>
+            </w:pPr>
+            <w:r>
+              <w:rPr>
+                <w:rFonts w:ascii="Arial" w:hAnsi="Arial"/>
+                <w:b/>
+                <w:sz w:val="20"/>
+                <w:rtl w:val="1"/>
+                <w:rFonts w:cs="Arial"/>
+              </w:rPr>
+              <w:t>מנוע funnel drop-off</w:t>
+            </w:r>
+          </w:p>
+        </w:tc>
+        <w:tc>
+          <w:tcPr>
+            <w:tcW w:type="dxa" w:w="2160"/>
+          </w:tcPr>
+          <w:p>
+            <w:pPr>
+              <w:bidi w:val="1"/>
+              <w:jc w:val="right"/>
+            </w:pPr>
+            <w:r>
+              <w:rPr>
+                <w:rFonts w:ascii="Arial" w:hAnsi="Arial"/>
+                <w:b w:val="0"/>
+                <w:sz w:val="20"/>
+                <w:rtl w:val="1"/>
+                <w:rFonts w:cs="Arial"/>
+              </w:rPr>
+              <w:t>טרם</w:t>
+            </w:r>
+          </w:p>
+        </w:tc>
+        <w:tc>
+          <w:tcPr>
+            <w:tcW w:type="dxa" w:w="2160"/>
+          </w:tcPr>
+          <w:p>
+            <w:pPr>
+              <w:bidi w:val="1"/>
+              <w:jc w:val="right"/>
+            </w:pPr>
+            <w:r>
+              <w:rPr>
+                <w:rFonts w:ascii="Arial" w:hAnsi="Arial"/>
+                <w:b w:val="0"/>
+                <w:sz w:val="20"/>
+                <w:rtl w:val="1"/>
+                <w:rFonts w:cs="Arial"/>
+              </w:rPr>
+              <w:t>זיהוי נקודת-נשירה + ניתוח</w:t>
+            </w:r>
+          </w:p>
+        </w:tc>
+      </w:tr>
+      <w:tr>
+        <w:tc>
+          <w:tcPr>
+            <w:tcW w:type="dxa" w:w="2160"/>
+          </w:tcPr>
+          <w:p>
+            <w:pPr>
+              <w:bidi w:val="1"/>
+              <w:jc w:val="right"/>
+            </w:pPr>
+            <w:r>
+              <w:rPr>
+                <w:rFonts w:ascii="Arial" w:hAnsi="Arial"/>
+                <w:b w:val="0"/>
+                <w:sz w:val="20"/>
+                <w:rtl w:val="1"/>
+                <w:rFonts w:cs="Arial"/>
+              </w:rPr>
+              <w:t>5</w:t>
+            </w:r>
+          </w:p>
+        </w:tc>
+        <w:tc>
+          <w:tcPr>
+            <w:tcW w:type="dxa" w:w="2160"/>
+          </w:tcPr>
+          <w:p>
+            <w:pPr>
+              <w:bidi w:val="1"/>
+              <w:jc w:val="right"/>
+            </w:pPr>
+            <w:r>
+              <w:rPr>
+                <w:rFonts w:ascii="Arial" w:hAnsi="Arial"/>
+                <w:b/>
+                <w:sz w:val="20"/>
+                <w:rtl w:val="1"/>
+                <w:rFonts w:cs="Arial"/>
+              </w:rPr>
+              <w:t>מנוע retention/cohort</w:t>
+            </w:r>
+          </w:p>
+        </w:tc>
+        <w:tc>
+          <w:tcPr>
+            <w:tcW w:type="dxa" w:w="2160"/>
+          </w:tcPr>
+          <w:p>
+            <w:pPr>
+              <w:bidi w:val="1"/>
+              <w:jc w:val="right"/>
+            </w:pPr>
+            <w:r>
+              <w:rPr>
+                <w:rFonts w:ascii="Arial" w:hAnsi="Arial"/>
+                <w:b w:val="0"/>
+                <w:sz w:val="20"/>
+                <w:rtl w:val="1"/>
+                <w:rFonts w:cs="Arial"/>
+              </w:rPr>
+              <w:t>טרם</w:t>
+            </w:r>
+          </w:p>
+        </w:tc>
+        <w:tc>
+          <w:tcPr>
+            <w:tcW w:type="dxa" w:w="2160"/>
+          </w:tcPr>
+          <w:p>
+            <w:pPr>
+              <w:bidi w:val="1"/>
+              <w:jc w:val="right"/>
+            </w:pPr>
+            <w:r>
+              <w:rPr>
+                <w:rFonts w:ascii="Arial" w:hAnsi="Arial"/>
+                <w:b w:val="0"/>
+                <w:sz w:val="20"/>
+                <w:rtl w:val="1"/>
+                <w:rFonts w:cs="Arial"/>
+              </w:rPr>
+              <w:t>retention curves + cohort heatmap</w:t>
+            </w:r>
+          </w:p>
+        </w:tc>
+      </w:tr>
+      <w:tr>
+        <w:tc>
+          <w:tcPr>
+            <w:tcW w:type="dxa" w:w="2160"/>
+          </w:tcPr>
+          <w:p>
+            <w:pPr>
+              <w:bidi w:val="1"/>
+              <w:jc w:val="right"/>
+            </w:pPr>
+            <w:r>
+              <w:rPr>
+                <w:rFonts w:ascii="Arial" w:hAnsi="Arial"/>
+                <w:b w:val="0"/>
+                <w:sz w:val="20"/>
+                <w:rtl w:val="1"/>
+                <w:rFonts w:cs="Arial"/>
+              </w:rPr>
+              <w:t>6</w:t>
+            </w:r>
+          </w:p>
+        </w:tc>
+        <w:tc>
+          <w:tcPr>
+            <w:tcW w:type="dxa" w:w="2160"/>
+          </w:tcPr>
+          <w:p>
+            <w:pPr>
+              <w:bidi w:val="1"/>
+              <w:jc w:val="right"/>
+            </w:pPr>
+            <w:r>
+              <w:rPr>
+                <w:rFonts w:ascii="Arial" w:hAnsi="Arial"/>
+                <w:b/>
+                <w:sz w:val="20"/>
+                <w:rtl w:val="1"/>
+                <w:rFonts w:cs="Arial"/>
+              </w:rPr>
+              <w:t>סוכן Growth Doctor (Ollama)</w:t>
+            </w:r>
+          </w:p>
+        </w:tc>
+        <w:tc>
+          <w:tcPr>
+            <w:tcW w:type="dxa" w:w="2160"/>
+          </w:tcPr>
+          <w:p>
+            <w:pPr>
+              <w:bidi w:val="1"/>
+              <w:jc w:val="right"/>
+            </w:pPr>
+            <w:r>
+              <w:rPr>
+                <w:rFonts w:ascii="Arial" w:hAnsi="Arial"/>
+                <w:b w:val="0"/>
+                <w:sz w:val="20"/>
+                <w:rtl w:val="1"/>
+                <w:rFonts w:cs="Arial"/>
+              </w:rPr>
+              <w:t>טרם</w:t>
+            </w:r>
+          </w:p>
+        </w:tc>
+        <w:tc>
+          <w:tcPr>
+            <w:tcW w:type="dxa" w:w="2160"/>
+          </w:tcPr>
+          <w:p>
+            <w:pPr>
+              <w:bidi w:val="1"/>
+              <w:jc w:val="right"/>
+            </w:pPr>
+            <w:r>
+              <w:rPr>
+                <w:rFonts w:ascii="Arial" w:hAnsi="Arial"/>
+                <w:b w:val="0"/>
+                <w:sz w:val="20"/>
+                <w:rtl w:val="1"/>
+                <w:rFonts w:cs="Arial"/>
+              </w:rPr>
+              <w:t>תובנה→המלצה→</w:t>
+            </w:r>
+            <w:r>
+              <w:rPr>
+                <w:rFonts w:ascii="Arial" w:hAnsi="Arial"/>
+                <w:b/>
+                <w:sz w:val="20"/>
+                <w:rtl w:val="1"/>
+                <w:rFonts w:cs="Arial"/>
+              </w:rPr>
+              <w:t>חיווט ל-Landing/A-B/Campaigns</w:t>
+            </w:r>
+          </w:p>
+        </w:tc>
+      </w:tr>
+      <w:tr>
+        <w:tc>
+          <w:tcPr>
+            <w:tcW w:type="dxa" w:w="2160"/>
+          </w:tcPr>
+          <w:p>
+            <w:pPr>
+              <w:bidi w:val="1"/>
+              <w:jc w:val="right"/>
+            </w:pPr>
+            <w:r>
+              <w:rPr>
+                <w:rFonts w:ascii="Arial" w:hAnsi="Arial"/>
+                <w:b w:val="0"/>
+                <w:sz w:val="20"/>
+                <w:rtl w:val="1"/>
+                <w:rFonts w:cs="Arial"/>
+              </w:rPr>
+              <w:t>7</w:t>
+            </w:r>
+          </w:p>
+        </w:tc>
+        <w:tc>
+          <w:tcPr>
+            <w:tcW w:type="dxa" w:w="2160"/>
+          </w:tcPr>
+          <w:p>
+            <w:pPr>
+              <w:bidi w:val="1"/>
+              <w:jc w:val="right"/>
+            </w:pPr>
+            <w:r>
+              <w:rPr>
+                <w:rFonts w:ascii="Arial" w:hAnsi="Arial"/>
+                <w:b/>
+                <w:sz w:val="20"/>
+                <w:rtl w:val="1"/>
+                <w:rFonts w:cs="Arial"/>
+              </w:rPr>
+              <w:t>מסכים</w:t>
+            </w:r>
+            <w:r>
+              <w:rPr>
+                <w:rFonts w:ascii="Arial" w:hAnsi="Arial"/>
+                <w:b w:val="0"/>
+                <w:sz w:val="20"/>
+                <w:rtl w:val="1"/>
+                <w:rFonts w:cs="Arial"/>
+              </w:rPr>
+              <w:t xml:space="preserve"> — Heatmap/Funnel/Cohort/Insights</w:t>
+            </w:r>
+          </w:p>
+        </w:tc>
+        <w:tc>
+          <w:tcPr>
+            <w:tcW w:type="dxa" w:w="2160"/>
+          </w:tcPr>
+          <w:p>
+            <w:pPr>
+              <w:bidi w:val="1"/>
+              <w:jc w:val="right"/>
+            </w:pPr>
+            <w:r>
+              <w:rPr>
+                <w:rFonts w:ascii="Arial" w:hAnsi="Arial"/>
+                <w:b w:val="0"/>
+                <w:sz w:val="20"/>
+                <w:rtl w:val="1"/>
+                <w:rFonts w:cs="Arial"/>
+              </w:rPr>
+              <w:t>טרם</w:t>
+            </w:r>
+          </w:p>
+        </w:tc>
+        <w:tc>
+          <w:tcPr>
+            <w:tcW w:type="dxa" w:w="2160"/>
+          </w:tcPr>
+          <w:p>
+            <w:pPr>
+              <w:bidi w:val="1"/>
+              <w:jc w:val="right"/>
+            </w:pPr>
+            <w:r>
+              <w:rPr>
+                <w:rFonts w:ascii="Arial" w:hAnsi="Arial"/>
+                <w:b w:val="0"/>
+                <w:sz w:val="20"/>
+                <w:rtl w:val="1"/>
+                <w:rFonts w:cs="Arial"/>
+              </w:rPr>
+              <w:t>(הבסיס הוויזואלי קיים ב-Artifact)</w:t>
+            </w:r>
+          </w:p>
+        </w:tc>
+      </w:tr>
+      <w:tr>
+        <w:tc>
+          <w:tcPr>
+            <w:tcW w:type="dxa" w:w="2160"/>
+          </w:tcPr>
+          <w:p>
+            <w:pPr>
+              <w:bidi w:val="1"/>
+              <w:jc w:val="right"/>
+            </w:pPr>
+            <w:r>
+              <w:rPr>
+                <w:rFonts w:ascii="Arial" w:hAnsi="Arial"/>
+                <w:b w:val="0"/>
+                <w:sz w:val="20"/>
+                <w:rtl w:val="1"/>
+                <w:rFonts w:cs="Arial"/>
+              </w:rPr>
+              <w:t>8</w:t>
+            </w:r>
+          </w:p>
+        </w:tc>
+        <w:tc>
+          <w:tcPr>
+            <w:tcW w:type="dxa" w:w="2160"/>
+          </w:tcPr>
+          <w:p>
+            <w:pPr>
+              <w:bidi w:val="1"/>
+              <w:jc w:val="right"/>
+            </w:pPr>
+            <w:r>
+              <w:rPr>
+                <w:rFonts w:ascii="Arial" w:hAnsi="Arial"/>
+                <w:b/>
+                <w:sz w:val="20"/>
+                <w:rtl w:val="1"/>
+                <w:rFonts w:cs="Arial"/>
+              </w:rPr>
+              <w:t>בוט מלא (וואטסאפ/טלגרם/מייל)</w:t>
+            </w:r>
+          </w:p>
+        </w:tc>
+        <w:tc>
+          <w:tcPr>
+            <w:tcW w:type="dxa" w:w="2160"/>
+          </w:tcPr>
+          <w:p>
+            <w:pPr>
+              <w:bidi w:val="1"/>
+              <w:jc w:val="right"/>
+            </w:pPr>
+            <w:r>
+              <w:rPr>
+                <w:rFonts w:ascii="Arial" w:hAnsi="Arial"/>
+                <w:b w:val="0"/>
+                <w:sz w:val="20"/>
+                <w:rtl w:val="1"/>
+                <w:rFonts w:cs="Arial"/>
+              </w:rPr>
+              <w:t>טרם</w:t>
+            </w:r>
+          </w:p>
+        </w:tc>
+        <w:tc>
+          <w:tcPr>
+            <w:tcW w:type="dxa" w:w="2160"/>
+          </w:tcPr>
+          <w:p>
+            <w:pPr>
+              <w:bidi w:val="1"/>
+              <w:jc w:val="right"/>
+            </w:pPr>
+            <w:r>
+              <w:rPr>
+                <w:rFonts w:ascii="Arial" w:hAnsi="Arial"/>
+                <w:b w:val="0"/>
+                <w:sz w:val="20"/>
+                <w:rtl w:val="1"/>
+                <w:rFonts w:cs="Arial"/>
+              </w:rPr>
+              <w:t xml:space="preserve">webhook </w:t>
+            </w:r>
+            <w:r>
+              <w:rPr>
+                <w:rFonts w:ascii="Consolas" w:hAnsi="Consolas"/>
+                <w:b w:val="0"/>
+                <w:color w:val="B02A37"/>
+                <w:sz w:val="20"/>
+                <w:rtl w:val="1"/>
+                <w:rFonts w:cs="Consolas"/>
+              </w:rPr>
+              <w:t>/api/bot</w:t>
+            </w:r>
+            <w:r>
+              <w:rPr>
+                <w:rFonts w:ascii="Arial" w:hAnsi="Arial"/>
+                <w:b w:val="0"/>
+                <w:sz w:val="20"/>
+                <w:rtl w:val="1"/>
+                <w:rFonts w:cs="Arial"/>
+              </w:rPr>
+              <w:t xml:space="preserve"> + router (מודל HELIX OPS) — §3.5</w:t>
+            </w:r>
+          </w:p>
+        </w:tc>
+      </w:tr>
+      <w:tr>
+        <w:tc>
+          <w:tcPr>
+            <w:tcW w:type="dxa" w:w="2160"/>
+          </w:tcPr>
+          <w:p>
+            <w:pPr>
+              <w:bidi w:val="1"/>
+              <w:jc w:val="right"/>
+            </w:pPr>
+            <w:r>
+              <w:rPr>
+                <w:rFonts w:ascii="Arial" w:hAnsi="Arial"/>
+                <w:b w:val="0"/>
+                <w:sz w:val="20"/>
+                <w:rtl w:val="1"/>
+                <w:rFonts w:cs="Arial"/>
+              </w:rPr>
+              <w:t>9</w:t>
+            </w:r>
+          </w:p>
+        </w:tc>
+        <w:tc>
+          <w:tcPr>
+            <w:tcW w:type="dxa" w:w="2160"/>
+          </w:tcPr>
+          <w:p>
+            <w:pPr>
+              <w:bidi w:val="1"/>
+              <w:jc w:val="right"/>
+            </w:pPr>
+            <w:r>
+              <w:rPr>
+                <w:rFonts w:ascii="Arial" w:hAnsi="Arial"/>
+                <w:b/>
+                <w:sz w:val="20"/>
+                <w:rtl w:val="1"/>
+                <w:rFonts w:cs="Arial"/>
+              </w:rPr>
+              <w:t>חיבור דשבורדים</w:t>
+            </w:r>
+          </w:p>
+        </w:tc>
+        <w:tc>
+          <w:tcPr>
+            <w:tcW w:type="dxa" w:w="2160"/>
+          </w:tcPr>
+          <w:p>
+            <w:pPr>
+              <w:bidi w:val="1"/>
+              <w:jc w:val="right"/>
+            </w:pPr>
+            <w:r>
+              <w:rPr>
+                <w:rFonts w:ascii="Arial" w:hAnsi="Arial"/>
+                <w:b w:val="0"/>
+                <w:sz w:val="20"/>
+                <w:rtl w:val="1"/>
+                <w:rFonts w:cs="Arial"/>
+              </w:rPr>
+              <w:t>טרם</w:t>
+            </w:r>
+          </w:p>
+        </w:tc>
+        <w:tc>
+          <w:tcPr>
+            <w:tcW w:type="dxa" w:w="2160"/>
+          </w:tcPr>
+          <w:p>
+            <w:pPr>
+              <w:bidi w:val="1"/>
+              <w:jc w:val="right"/>
+            </w:pPr>
+            <w:r>
+              <w:rPr>
+                <w:rFonts w:ascii="Consolas" w:hAnsi="Consolas"/>
+                <w:b w:val="0"/>
+                <w:color w:val="B02A37"/>
+                <w:sz w:val="20"/>
+                <w:rtl w:val="1"/>
+                <w:rFonts w:cs="Consolas"/>
+              </w:rPr>
+              <w:t>/api/export/growth-metrics</w:t>
+            </w:r>
+            <w:r>
+              <w:rPr>
+                <w:rFonts w:ascii="Arial" w:hAnsi="Arial"/>
+                <w:b w:val="0"/>
+                <w:sz w:val="20"/>
+                <w:rtl w:val="1"/>
+                <w:rFonts w:cs="Arial"/>
+              </w:rPr>
+              <w:t xml:space="preserve"> + connector </w:t>
+            </w:r>
+            <w:r>
+              <w:rPr>
+                <w:rFonts w:ascii="Consolas" w:hAnsi="Consolas"/>
+                <w:b w:val="0"/>
+                <w:color w:val="B02A37"/>
+                <w:sz w:val="20"/>
+                <w:rtl w:val="1"/>
+                <w:rFonts w:cs="Consolas"/>
+              </w:rPr>
+              <w:t>helix_growth</w:t>
+            </w:r>
+            <w:r>
+              <w:rPr>
+                <w:rFonts w:ascii="Arial" w:hAnsi="Arial"/>
+                <w:b w:val="0"/>
+                <w:sz w:val="20"/>
+                <w:rtl w:val="1"/>
+                <w:rFonts w:cs="Arial"/>
+              </w:rPr>
+              <w:t xml:space="preserve"> — §3.5</w:t>
+            </w:r>
+          </w:p>
+        </w:tc>
+      </w:tr>
+      <w:tr>
+        <w:tc>
+          <w:tcPr>
+            <w:tcW w:type="dxa" w:w="2160"/>
+          </w:tcPr>
+          <w:p>
+            <w:pPr>
+              <w:bidi w:val="1"/>
+              <w:jc w:val="right"/>
+            </w:pPr>
+            <w:r>
+              <w:rPr>
+                <w:rFonts w:ascii="Arial" w:hAnsi="Arial"/>
+                <w:b w:val="0"/>
+                <w:sz w:val="20"/>
+                <w:rtl w:val="1"/>
+                <w:rFonts w:cs="Arial"/>
+              </w:rPr>
+              <w:t>10</w:t>
+            </w:r>
+          </w:p>
+        </w:tc>
+        <w:tc>
+          <w:tcPr>
+            <w:tcW w:type="dxa" w:w="2160"/>
+          </w:tcPr>
+          <w:p>
+            <w:pPr>
+              <w:bidi w:val="1"/>
+              <w:jc w:val="right"/>
+            </w:pPr>
+            <w:r>
+              <w:rPr>
+                <w:rFonts w:ascii="Arial" w:hAnsi="Arial"/>
+                <w:b/>
+                <w:sz w:val="20"/>
+                <w:rtl w:val="1"/>
+                <w:rFonts w:cs="Arial"/>
+              </w:rPr>
+              <w:t>לולאה אוטונומית</w:t>
+            </w:r>
+          </w:p>
+        </w:tc>
+        <w:tc>
+          <w:tcPr>
+            <w:tcW w:type="dxa" w:w="2160"/>
+          </w:tcPr>
+          <w:p>
+            <w:pPr>
+              <w:bidi w:val="1"/>
+              <w:jc w:val="right"/>
+            </w:pPr>
+            <w:r>
+              <w:rPr>
+                <w:rFonts w:ascii="Arial" w:hAnsi="Arial"/>
+                <w:b w:val="0"/>
+                <w:sz w:val="20"/>
+                <w:rtl w:val="1"/>
+                <w:rFonts w:cs="Arial"/>
+              </w:rPr>
+              <w:t>טרם</w:t>
+            </w:r>
+          </w:p>
+        </w:tc>
+        <w:tc>
+          <w:tcPr>
+            <w:tcW w:type="dxa" w:w="2160"/>
+          </w:tcPr>
+          <w:p>
+            <w:pPr>
+              <w:bidi w:val="1"/>
+              <w:jc w:val="right"/>
+            </w:pPr>
+            <w:r>
+              <w:rPr>
+                <w:rFonts w:ascii="Arial" w:hAnsi="Arial"/>
+                <w:b w:val="0"/>
+                <w:sz w:val="20"/>
+                <w:rtl w:val="1"/>
+                <w:rFonts w:cs="Arial"/>
+              </w:rPr>
+              <w:t>measure→fix→re-measure (cron)</w:t>
+            </w:r>
+          </w:p>
+        </w:tc>
+      </w:tr>
+      <w:tr>
+        <w:tc>
+          <w:tcPr>
+            <w:tcW w:type="dxa" w:w="2160"/>
+          </w:tcPr>
+          <w:p>
+            <w:pPr>
+              <w:bidi w:val="1"/>
+              <w:jc w:val="right"/>
+            </w:pPr>
+            <w:r>
+              <w:rPr>
+                <w:rFonts w:ascii="Arial" w:hAnsi="Arial"/>
+                <w:b w:val="0"/>
+                <w:sz w:val="20"/>
+                <w:rtl w:val="1"/>
+                <w:rFonts w:cs="Arial"/>
+              </w:rPr>
+              <w:t>11</w:t>
+            </w:r>
+          </w:p>
+        </w:tc>
+        <w:tc>
+          <w:tcPr>
+            <w:tcW w:type="dxa" w:w="2160"/>
+          </w:tcPr>
+          <w:p>
+            <w:pPr>
+              <w:bidi w:val="1"/>
+              <w:jc w:val="right"/>
+            </w:pPr>
+            <w:r>
+              <w:rPr>
+                <w:rFonts w:ascii="Arial" w:hAnsi="Arial"/>
+                <w:b/>
+                <w:sz w:val="20"/>
+                <w:rtl w:val="1"/>
+                <w:rFonts w:cs="Arial"/>
+              </w:rPr>
+              <w:t>חיבורים חיצוניים</w:t>
+            </w:r>
+          </w:p>
+        </w:tc>
+        <w:tc>
+          <w:tcPr>
+            <w:tcW w:type="dxa" w:w="2160"/>
+          </w:tcPr>
+          <w:p>
+            <w:pPr>
+              <w:bidi w:val="1"/>
+              <w:jc w:val="right"/>
+            </w:pPr>
+            <w:r>
+              <w:rPr>
+                <w:rFonts w:ascii="Arial" w:hAnsi="Arial"/>
+                <w:b w:val="0"/>
+                <w:sz w:val="20"/>
+                <w:rtl w:val="1"/>
+                <w:rFonts w:cs="Arial"/>
+              </w:rPr>
+              <w:t>✅ מתועד</w:t>
+            </w:r>
+          </w:p>
+        </w:tc>
+        <w:tc>
+          <w:tcPr>
+            <w:tcW w:type="dxa" w:w="2160"/>
+          </w:tcPr>
+          <w:p>
+            <w:pPr>
+              <w:bidi w:val="1"/>
+              <w:jc w:val="right"/>
+            </w:pPr>
+            <w:r>
+              <w:rPr>
+                <w:rFonts w:ascii="Arial" w:hAnsi="Arial"/>
+                <w:b w:val="0"/>
+                <w:sz w:val="20"/>
+                <w:rtl w:val="1"/>
+                <w:rFonts w:cs="Arial"/>
+              </w:rPr>
+              <w:t xml:space="preserve">ראה </w:t>
+            </w:r>
+            <w:r>
+              <w:rPr>
+                <w:rFonts w:ascii="Consolas" w:hAnsi="Consolas"/>
+                <w:b w:val="0"/>
+                <w:color w:val="B02A37"/>
+                <w:sz w:val="20"/>
+                <w:rtl w:val="1"/>
+                <w:rFonts w:cs="Consolas"/>
+              </w:rPr>
+              <w:t>HELIX-external-connections.xlsx</w:t>
+            </w:r>
+            <w:r>
+              <w:rPr>
+                <w:rFonts w:ascii="Arial" w:hAnsi="Arial"/>
+                <w:b w:val="0"/>
+                <w:sz w:val="20"/>
+                <w:rtl w:val="1"/>
+                <w:rFonts w:cs="Arial"/>
+              </w:rPr>
+              <w:t xml:space="preserve"> → גיליון HELIX Growth Doctor</w:t>
+            </w:r>
+          </w:p>
+        </w:tc>
+      </w:tr>
+    </w:tbl>
+    <w:p>
+      <w:pPr>
         <w:bidi w:val="1"/>
         <w:jc w:val="right"/>
       </w:pPr>

</xml_diff>

<commit_message>
docs(growth-doctor): update build-status §11 to built MVP + xlsx repo name
Co-Authored-By: Claude Opus 4.8 (1M context) <noreply@anthropic.com>
</commit_message>
<xml_diff>
--- a/PRODUCTS/07-growth-doctor.docx
+++ b/PRODUCTS/07-growth-doctor.docx
@@ -271,7 +271,18 @@
           <w:rtl w:val="1"/>
           <w:rFonts w:cs="Arial"/>
         </w:rPr>
-        <w:t>נגזר מדיון-שוק אמיתי (יזמים, 2026-07): ROI מקסימלי = לשפר את מי שכבר מגיע, לא לקנות עוד תנועה. תאריך: 2026-07-22 · סטטוס: אפיון (טרם בנייה — ממתין לגיט).</w:t>
+        <w:t xml:space="preserve">נגזר מדיון-שוק אמיתי (יזמים, 2026-07): ROI מקסימלי = לשפר את מי שכבר מגיע, לא לקנות עוד תנועה. תאריך: 2026-07-22 · </w:t>
+      </w:r>
+      <w:r>
+        <w:rPr>
+          <w:rFonts w:ascii="Arial" w:hAnsi="Arial"/>
+          <w:b/>
+          <w:i/>
+          <w:sz w:val="22"/>
+          <w:rtl w:val="1"/>
+          <w:rFonts w:cs="Arial"/>
+        </w:rPr>
+        <w:t>סטטוס: MVP נבנה בקוד (build נקי), נדחף לגיט `Helix-growth-doctor`. טרם רץ live.</w:t>
       </w:r>
     </w:p>
     <w:p>
@@ -6194,7 +6205,7 @@
           <w:rtl w:val="1"/>
           <w:rFonts w:cs="Arial"/>
         </w:rPr>
-        <w:t>סטטוס: אפיון מלא — טרם בנייה בקוד.</w:t>
+        <w:t>סטטוס: MVP נבנה בקוד (typecheck+build נקי), נדחף לרפו `Helix-growth-doctor` (branch main). טרם רץ live.</w:t>
       </w:r>
       <w:r>
         <w:rPr>
@@ -6205,7 +6216,7 @@
           <w:rtl w:val="1"/>
           <w:rFonts w:cs="Arial"/>
         </w:rPr>
-        <w:t xml:space="preserve"> (ממתין לגיט ייעודי שהמשתמש פותח.)</w:t>
+        <w:t xml:space="preserve"> Stack: Next.js 15 + TS + Tailwind + Supabase (RTL), scaffold מ-helix-dashboards.</w:t>
       </w:r>
     </w:p>
     <w:p>
@@ -6222,90 +6233,915 @@
           <w:rtl w:val="1"/>
           <w:rFonts w:cs="Arial"/>
         </w:rPr>
-        <w:t>✅ מה נעשה</w:t>
+        <w:t>✅ נבנה (end-to-end)</w:t>
       </w:r>
     </w:p>
-    <w:p>
-      <w:pPr>
-        <w:pStyle w:val="ListBullet"/>
-        <w:bidi w:val="1"/>
-        <w:jc w:val="right"/>
-      </w:pPr>
-      <w:r>
-        <w:rPr>
-          <w:rFonts w:ascii="Arial" w:hAnsi="Arial"/>
-          <w:b/>
-          <w:sz w:val="22"/>
-          <w:rtl w:val="1"/>
-          <w:rFonts w:cs="Arial"/>
-        </w:rPr>
-        <w:t>מפרט מלא</w:t>
-      </w:r>
-      <w:r>
-        <w:rPr>
-          <w:rFonts w:ascii="Arial" w:hAnsi="Arial"/>
-          <w:b w:val="0"/>
-          <w:sz w:val="22"/>
-          <w:rtl w:val="1"/>
-          <w:rFonts w:cs="Arial"/>
-        </w:rPr>
-        <w:t xml:space="preserve"> (המסמך הזה) — 2 צירים, כל הפיצ'רים, מטריצת-מתחרים, פרטיות, מקורות-נתונים, מסכים, מונטיזציה, סדר-בנייה.</w:t>
-      </w:r>
-    </w:p>
-    <w:p>
-      <w:pPr>
-        <w:pStyle w:val="ListBullet"/>
-        <w:bidi w:val="1"/>
-        <w:jc w:val="right"/>
-      </w:pPr>
-      <w:r>
-        <w:rPr>
-          <w:rFonts w:ascii="Arial" w:hAnsi="Arial"/>
-          <w:b/>
-          <w:sz w:val="22"/>
-          <w:rtl w:val="1"/>
-          <w:rFonts w:cs="Arial"/>
-        </w:rPr>
-        <w:t>Artifact ויזואלי</w:t>
-      </w:r>
-      <w:r>
-        <w:rPr>
-          <w:rFonts w:ascii="Arial" w:hAnsi="Arial"/>
-          <w:b w:val="0"/>
-          <w:sz w:val="22"/>
-          <w:rtl w:val="1"/>
-          <w:rFonts w:cs="Arial"/>
-        </w:rPr>
-        <w:t xml:space="preserve"> — הדגמה חיה: page-heatmap · funnel drop-off · cohort retention heatmap · כרטיסי-אבחון · מטריצת-מתחרים · דייג'סט-בוט.</w:t>
-      </w:r>
-    </w:p>
-    <w:p>
-      <w:pPr>
-        <w:pStyle w:val="ListBullet"/>
-        <w:bidi w:val="1"/>
-        <w:jc w:val="right"/>
-      </w:pPr>
-      <w:r>
-        <w:rPr>
-          <w:rFonts w:ascii="Arial" w:hAnsi="Arial"/>
-          <w:b/>
-          <w:sz w:val="22"/>
-          <w:rtl w:val="1"/>
-          <w:rFonts w:cs="Arial"/>
-        </w:rPr>
-        <w:t>מיפוי שימוש-חוזר</w:t>
-      </w:r>
-      <w:r>
-        <w:rPr>
-          <w:rFonts w:ascii="Arial" w:hAnsi="Arial"/>
-          <w:b w:val="0"/>
-          <w:sz w:val="22"/>
-          <w:rtl w:val="1"/>
-          <w:rFonts w:cs="Arial"/>
-        </w:rPr>
-        <w:t xml:space="preserve"> — ~80% מהתשתית כבר קיימת (Landing/A-B/Campaigns/attribution/Churn-Radar/Ollama/בוט/דשבורדים).</w:t>
-      </w:r>
-    </w:p>
+    <w:tbl>
+      <w:tblPr>
+        <w:tblStyle w:val="LightGrid-Accent1"/>
+        <w:tblW w:type="auto" w:w="0"/>
+        <w:tblLook w:firstColumn="1" w:firstRow="1" w:lastColumn="0" w:lastRow="0" w:noHBand="0" w:noVBand="1" w:val="04A0"/>
+        <w:bidiVisual/>
+      </w:tblPr>
+      <w:tblGrid>
+        <w:gridCol w:w="4320"/>
+        <w:gridCol w:w="4320"/>
+      </w:tblGrid>
+      <w:tr>
+        <w:tc>
+          <w:tcPr>
+            <w:tcW w:type="dxa" w:w="4320"/>
+          </w:tcPr>
+          <w:p>
+            <w:pPr>
+              <w:bidi w:val="1"/>
+              <w:jc w:val="right"/>
+            </w:pPr>
+            <w:r>
+              <w:rPr>
+                <w:rFonts w:ascii="Arial" w:hAnsi="Arial"/>
+                <w:b/>
+                <w:sz w:val="20"/>
+                <w:rtl w:val="1"/>
+                <w:rFonts w:cs="Arial"/>
+              </w:rPr>
+              <w:t>רכיב</w:t>
+            </w:r>
+          </w:p>
+        </w:tc>
+        <w:tc>
+          <w:tcPr>
+            <w:tcW w:type="dxa" w:w="4320"/>
+          </w:tcPr>
+          <w:p>
+            <w:pPr>
+              <w:bidi w:val="1"/>
+              <w:jc w:val="right"/>
+            </w:pPr>
+            <w:r>
+              <w:rPr>
+                <w:rFonts w:ascii="Arial" w:hAnsi="Arial"/>
+                <w:b/>
+                <w:sz w:val="20"/>
+                <w:rtl w:val="1"/>
+                <w:rFonts w:cs="Arial"/>
+              </w:rPr>
+              <w:t>קבצים / routes</w:t>
+            </w:r>
+          </w:p>
+        </w:tc>
+      </w:tr>
+      <w:tr>
+        <w:tc>
+          <w:tcPr>
+            <w:tcW w:type="dxa" w:w="4320"/>
+          </w:tcPr>
+          <w:p>
+            <w:pPr>
+              <w:bidi w:val="1"/>
+              <w:jc w:val="right"/>
+            </w:pPr>
+            <w:r>
+              <w:rPr>
+                <w:rFonts w:ascii="Arial" w:hAnsi="Arial"/>
+                <w:b/>
+                <w:sz w:val="20"/>
+                <w:rtl w:val="1"/>
+                <w:rFonts w:cs="Arial"/>
+              </w:rPr>
+              <w:t>מנוע אירועים</w:t>
+            </w:r>
+            <w:r>
+              <w:rPr>
+                <w:rFonts w:ascii="Arial" w:hAnsi="Arial"/>
+                <w:b w:val="0"/>
+                <w:sz w:val="20"/>
+                <w:rtl w:val="1"/>
+                <w:rFonts w:cs="Arial"/>
+              </w:rPr>
+              <w:t xml:space="preserve"> — HELIX tag (snippet להטמעה) + קליטה</w:t>
+            </w:r>
+          </w:p>
+        </w:tc>
+        <w:tc>
+          <w:tcPr>
+            <w:tcW w:type="dxa" w:w="4320"/>
+          </w:tcPr>
+          <w:p>
+            <w:pPr>
+              <w:bidi w:val="1"/>
+              <w:jc w:val="right"/>
+            </w:pPr>
+            <w:r>
+              <w:rPr>
+                <w:rFonts w:ascii="Consolas" w:hAnsi="Consolas"/>
+                <w:b w:val="0"/>
+                <w:color w:val="B02A37"/>
+                <w:sz w:val="20"/>
+                <w:rtl w:val="1"/>
+                <w:rFonts w:cs="Consolas"/>
+              </w:rPr>
+              <w:t>public/helix-tag.js</w:t>
+            </w:r>
+            <w:r>
+              <w:rPr>
+                <w:rFonts w:ascii="Arial" w:hAnsi="Arial"/>
+                <w:b w:val="0"/>
+                <w:sz w:val="20"/>
+                <w:rtl w:val="1"/>
+                <w:rFonts w:cs="Arial"/>
+              </w:rPr>
+              <w:t xml:space="preserve">, </w:t>
+            </w:r>
+            <w:r>
+              <w:rPr>
+                <w:rFonts w:ascii="Consolas" w:hAnsi="Consolas"/>
+                <w:b w:val="0"/>
+                <w:color w:val="B02A37"/>
+                <w:sz w:val="20"/>
+                <w:rtl w:val="1"/>
+                <w:rFonts w:cs="Consolas"/>
+              </w:rPr>
+              <w:t>/api/collect</w:t>
+            </w:r>
+            <w:r>
+              <w:rPr>
+                <w:rFonts w:ascii="Arial" w:hAnsi="Arial"/>
+                <w:b w:val="0"/>
+                <w:sz w:val="20"/>
+                <w:rtl w:val="1"/>
+                <w:rFonts w:cs="Arial"/>
+              </w:rPr>
+              <w:t xml:space="preserve">, טבלת </w:t>
+            </w:r>
+            <w:r>
+              <w:rPr>
+                <w:rFonts w:ascii="Consolas" w:hAnsi="Consolas"/>
+                <w:b w:val="0"/>
+                <w:color w:val="B02A37"/>
+                <w:sz w:val="20"/>
+                <w:rtl w:val="1"/>
+                <w:rFonts w:cs="Consolas"/>
+              </w:rPr>
+              <w:t>events</w:t>
+            </w:r>
+          </w:p>
+        </w:tc>
+      </w:tr>
+      <w:tr>
+        <w:tc>
+          <w:tcPr>
+            <w:tcW w:type="dxa" w:w="4320"/>
+          </w:tcPr>
+          <w:p>
+            <w:pPr>
+              <w:bidi w:val="1"/>
+              <w:jc w:val="right"/>
+            </w:pPr>
+            <w:r>
+              <w:rPr>
+                <w:rFonts w:ascii="Arial" w:hAnsi="Arial"/>
+                <w:b/>
+                <w:sz w:val="20"/>
+                <w:rtl w:val="1"/>
+                <w:rFonts w:cs="Arial"/>
+              </w:rPr>
+              <w:t>מנוע funnel drop-off</w:t>
+            </w:r>
+            <w:r>
+              <w:rPr>
+                <w:rFonts w:ascii="Arial" w:hAnsi="Arial"/>
+                <w:b w:val="0"/>
+                <w:sz w:val="20"/>
+                <w:rtl w:val="1"/>
+                <w:rFonts w:cs="Arial"/>
+              </w:rPr>
+              <w:t xml:space="preserve"> — זיהוי נקודת-נשירה (מ-events, demo fallback)</w:t>
+            </w:r>
+          </w:p>
+        </w:tc>
+        <w:tc>
+          <w:tcPr>
+            <w:tcW w:type="dxa" w:w="4320"/>
+          </w:tcPr>
+          <w:p>
+            <w:pPr>
+              <w:bidi w:val="1"/>
+              <w:jc w:val="right"/>
+            </w:pPr>
+            <w:r>
+              <w:rPr>
+                <w:rFonts w:ascii="Consolas" w:hAnsi="Consolas"/>
+                <w:b w:val="0"/>
+                <w:color w:val="B02A37"/>
+                <w:sz w:val="20"/>
+                <w:rtl w:val="1"/>
+                <w:rFonts w:cs="Consolas"/>
+              </w:rPr>
+              <w:t>lib/analytics.ts</w:t>
+            </w:r>
+            <w:r>
+              <w:rPr>
+                <w:rFonts w:ascii="Arial" w:hAnsi="Arial"/>
+                <w:b w:val="0"/>
+                <w:sz w:val="20"/>
+                <w:rtl w:val="1"/>
+                <w:rFonts w:cs="Arial"/>
+              </w:rPr>
+              <w:t xml:space="preserve"> (</w:t>
+            </w:r>
+            <w:r>
+              <w:rPr>
+                <w:rFonts w:ascii="Consolas" w:hAnsi="Consolas"/>
+                <w:b w:val="0"/>
+                <w:color w:val="B02A37"/>
+                <w:sz w:val="20"/>
+                <w:rtl w:val="1"/>
+                <w:rFonts w:cs="Consolas"/>
+              </w:rPr>
+              <w:t>funnelFromEvents</w:t>
+            </w:r>
+            <w:r>
+              <w:rPr>
+                <w:rFonts w:ascii="Arial" w:hAnsi="Arial"/>
+                <w:b w:val="0"/>
+                <w:sz w:val="20"/>
+                <w:rtl w:val="1"/>
+                <w:rFonts w:cs="Arial"/>
+              </w:rPr>
+              <w:t>)</w:t>
+            </w:r>
+          </w:p>
+        </w:tc>
+      </w:tr>
+      <w:tr>
+        <w:tc>
+          <w:tcPr>
+            <w:tcW w:type="dxa" w:w="4320"/>
+          </w:tcPr>
+          <w:p>
+            <w:pPr>
+              <w:bidi w:val="1"/>
+              <w:jc w:val="right"/>
+            </w:pPr>
+            <w:r>
+              <w:rPr>
+                <w:rFonts w:ascii="Arial" w:hAnsi="Arial"/>
+                <w:b/>
+                <w:sz w:val="20"/>
+                <w:rtl w:val="1"/>
+                <w:rFonts w:cs="Arial"/>
+              </w:rPr>
+              <w:t>מנוע retention/cohort</w:t>
+            </w:r>
+            <w:r>
+              <w:rPr>
+                <w:rFonts w:ascii="Arial" w:hAnsi="Arial"/>
+                <w:b w:val="0"/>
+                <w:sz w:val="20"/>
+                <w:rtl w:val="1"/>
+                <w:rFonts w:cs="Arial"/>
+              </w:rPr>
+              <w:t xml:space="preserve"> — cohort heatmap</w:t>
+            </w:r>
+          </w:p>
+        </w:tc>
+        <w:tc>
+          <w:tcPr>
+            <w:tcW w:type="dxa" w:w="4320"/>
+          </w:tcPr>
+          <w:p>
+            <w:pPr>
+              <w:bidi w:val="1"/>
+              <w:jc w:val="right"/>
+            </w:pPr>
+            <w:r>
+              <w:rPr>
+                <w:rFonts w:ascii="Consolas" w:hAnsi="Consolas"/>
+                <w:b w:val="0"/>
+                <w:color w:val="B02A37"/>
+                <w:sz w:val="20"/>
+                <w:rtl w:val="1"/>
+                <w:rFonts w:cs="Consolas"/>
+              </w:rPr>
+              <w:t>lib/analytics.ts</w:t>
+            </w:r>
+            <w:r>
+              <w:rPr>
+                <w:rFonts w:ascii="Arial" w:hAnsi="Arial"/>
+                <w:b w:val="0"/>
+                <w:sz w:val="20"/>
+                <w:rtl w:val="1"/>
+                <w:rFonts w:cs="Arial"/>
+              </w:rPr>
+              <w:t xml:space="preserve"> (</w:t>
+            </w:r>
+            <w:r>
+              <w:rPr>
+                <w:rFonts w:ascii="Consolas" w:hAnsi="Consolas"/>
+                <w:b w:val="0"/>
+                <w:color w:val="B02A37"/>
+                <w:sz w:val="20"/>
+                <w:rtl w:val="1"/>
+                <w:rFonts w:cs="Consolas"/>
+              </w:rPr>
+              <w:t>demoCohorts</w:t>
+            </w:r>
+            <w:r>
+              <w:rPr>
+                <w:rFonts w:ascii="Arial" w:hAnsi="Arial"/>
+                <w:b w:val="0"/>
+                <w:sz w:val="20"/>
+                <w:rtl w:val="1"/>
+                <w:rFonts w:cs="Arial"/>
+              </w:rPr>
+              <w:t>)</w:t>
+            </w:r>
+          </w:p>
+        </w:tc>
+      </w:tr>
+      <w:tr>
+        <w:tc>
+          <w:tcPr>
+            <w:tcW w:type="dxa" w:w="4320"/>
+          </w:tcPr>
+          <w:p>
+            <w:pPr>
+              <w:bidi w:val="1"/>
+              <w:jc w:val="right"/>
+            </w:pPr>
+            <w:r>
+              <w:rPr>
+                <w:rFonts w:ascii="Arial" w:hAnsi="Arial"/>
+                <w:b/>
+                <w:sz w:val="20"/>
+                <w:rtl w:val="1"/>
+                <w:rFonts w:cs="Arial"/>
+              </w:rPr>
+              <w:t>סוכן אבחון (Doctor)</w:t>
+            </w:r>
+            <w:r>
+              <w:rPr>
+                <w:rFonts w:ascii="Arial" w:hAnsi="Arial"/>
+                <w:b w:val="0"/>
+                <w:sz w:val="20"/>
+                <w:rtl w:val="1"/>
+                <w:rFonts w:cs="Arial"/>
+              </w:rPr>
+              <w:t xml:space="preserve"> — rule-based → תובנה+פעולה + נרטיב עברי</w:t>
+            </w:r>
+          </w:p>
+        </w:tc>
+        <w:tc>
+          <w:tcPr>
+            <w:tcW w:type="dxa" w:w="4320"/>
+          </w:tcPr>
+          <w:p>
+            <w:pPr>
+              <w:bidi w:val="1"/>
+              <w:jc w:val="right"/>
+            </w:pPr>
+            <w:r>
+              <w:rPr>
+                <w:rFonts w:ascii="Consolas" w:hAnsi="Consolas"/>
+                <w:b w:val="0"/>
+                <w:color w:val="B02A37"/>
+                <w:sz w:val="20"/>
+                <w:rtl w:val="1"/>
+                <w:rFonts w:cs="Consolas"/>
+              </w:rPr>
+              <w:t>lib/doctor.ts</w:t>
+            </w:r>
+            <w:r>
+              <w:rPr>
+                <w:rFonts w:ascii="Arial" w:hAnsi="Arial"/>
+                <w:b w:val="0"/>
+                <w:sz w:val="20"/>
+                <w:rtl w:val="1"/>
+                <w:rFonts w:cs="Arial"/>
+              </w:rPr>
+              <w:t xml:space="preserve"> (</w:t>
+            </w:r>
+            <w:r>
+              <w:rPr>
+                <w:rFonts w:ascii="Consolas" w:hAnsi="Consolas"/>
+                <w:b w:val="0"/>
+                <w:color w:val="B02A37"/>
+                <w:sz w:val="20"/>
+                <w:rtl w:val="1"/>
+                <w:rFonts w:cs="Consolas"/>
+              </w:rPr>
+              <w:t>diagnose</w:t>
+            </w:r>
+            <w:r>
+              <w:rPr>
+                <w:rFonts w:ascii="Arial" w:hAnsi="Arial"/>
+                <w:b w:val="0"/>
+                <w:sz w:val="20"/>
+                <w:rtl w:val="1"/>
+                <w:rFonts w:cs="Arial"/>
+              </w:rPr>
+              <w:t xml:space="preserve">, </w:t>
+            </w:r>
+            <w:r>
+              <w:rPr>
+                <w:rFonts w:ascii="Consolas" w:hAnsi="Consolas"/>
+                <w:b w:val="0"/>
+                <w:color w:val="B02A37"/>
+                <w:sz w:val="20"/>
+                <w:rtl w:val="1"/>
+                <w:rFonts w:cs="Consolas"/>
+              </w:rPr>
+              <w:t>digestText</w:t>
+            </w:r>
+            <w:r>
+              <w:rPr>
+                <w:rFonts w:ascii="Arial" w:hAnsi="Arial"/>
+                <w:b w:val="0"/>
+                <w:sz w:val="20"/>
+                <w:rtl w:val="1"/>
+                <w:rFonts w:cs="Arial"/>
+              </w:rPr>
+              <w:t>)</w:t>
+            </w:r>
+          </w:p>
+        </w:tc>
+      </w:tr>
+      <w:tr>
+        <w:tc>
+          <w:tcPr>
+            <w:tcW w:type="dxa" w:w="4320"/>
+          </w:tcPr>
+          <w:p>
+            <w:pPr>
+              <w:bidi w:val="1"/>
+              <w:jc w:val="right"/>
+            </w:pPr>
+            <w:r>
+              <w:rPr>
+                <w:rFonts w:ascii="Arial" w:hAnsi="Arial"/>
+                <w:b/>
+                <w:sz w:val="20"/>
+                <w:rtl w:val="1"/>
+                <w:rFonts w:cs="Arial"/>
+              </w:rPr>
+              <w:t>Model Router (Ollama-first → Claude)</w:t>
+            </w:r>
+            <w:r>
+              <w:rPr>
+                <w:rFonts w:ascii="Arial" w:hAnsi="Arial"/>
+                <w:b w:val="0"/>
+                <w:sz w:val="20"/>
+                <w:rtl w:val="1"/>
+                <w:rFonts w:cs="Arial"/>
+              </w:rPr>
+              <w:t xml:space="preserve"> — on-prem לפרטיות</w:t>
+            </w:r>
+          </w:p>
+        </w:tc>
+        <w:tc>
+          <w:tcPr>
+            <w:tcW w:type="dxa" w:w="4320"/>
+          </w:tcPr>
+          <w:p>
+            <w:pPr>
+              <w:bidi w:val="1"/>
+              <w:jc w:val="right"/>
+            </w:pPr>
+            <w:r>
+              <w:rPr>
+                <w:rFonts w:ascii="Consolas" w:hAnsi="Consolas"/>
+                <w:b w:val="0"/>
+                <w:color w:val="B02A37"/>
+                <w:sz w:val="20"/>
+                <w:rtl w:val="1"/>
+                <w:rFonts w:cs="Consolas"/>
+              </w:rPr>
+              <w:t>lib/ollama.ts</w:t>
+            </w:r>
+          </w:p>
+        </w:tc>
+      </w:tr>
+      <w:tr>
+        <w:tc>
+          <w:tcPr>
+            <w:tcW w:type="dxa" w:w="4320"/>
+          </w:tcPr>
+          <w:p>
+            <w:pPr>
+              <w:bidi w:val="1"/>
+              <w:jc w:val="right"/>
+            </w:pPr>
+            <w:r>
+              <w:rPr>
+                <w:rFonts w:ascii="Arial" w:hAnsi="Arial"/>
+                <w:b/>
+                <w:sz w:val="20"/>
+                <w:rtl w:val="1"/>
+                <w:rFonts w:cs="Arial"/>
+              </w:rPr>
+              <w:t>דשבורד ויזואלי</w:t>
+            </w:r>
+            <w:r>
+              <w:rPr>
+                <w:rFonts w:ascii="Arial" w:hAnsi="Arial"/>
+                <w:b w:val="0"/>
+                <w:sz w:val="20"/>
+                <w:rtl w:val="1"/>
+                <w:rFonts w:cs="Arial"/>
+              </w:rPr>
+              <w:t xml:space="preserve"> — </w:t>
+            </w:r>
+            <w:r>
+              <w:rPr>
+                <w:rFonts w:ascii="Arial" w:hAnsi="Arial"/>
+                <w:b/>
+                <w:sz w:val="20"/>
+                <w:rtl w:val="1"/>
+                <w:rFonts w:cs="Arial"/>
+              </w:rPr>
+              <w:t>מפת-חום (canvas)</w:t>
+            </w:r>
+            <w:r>
+              <w:rPr>
+                <w:rFonts w:ascii="Arial" w:hAnsi="Arial"/>
+                <w:b w:val="0"/>
+                <w:sz w:val="20"/>
+                <w:rtl w:val="1"/>
+                <w:rFonts w:cs="Arial"/>
+              </w:rPr>
+              <w:t xml:space="preserve"> · משפך · </w:t>
+            </w:r>
+            <w:r>
+              <w:rPr>
+                <w:rFonts w:ascii="Arial" w:hAnsi="Arial"/>
+                <w:b/>
+                <w:sz w:val="20"/>
+                <w:rtl w:val="1"/>
+                <w:rFonts w:cs="Arial"/>
+              </w:rPr>
+              <w:t>cohort heatmap</w:t>
+            </w:r>
+            <w:r>
+              <w:rPr>
+                <w:rFonts w:ascii="Arial" w:hAnsi="Arial"/>
+                <w:b w:val="0"/>
+                <w:sz w:val="20"/>
+                <w:rtl w:val="1"/>
+                <w:rFonts w:cs="Arial"/>
+              </w:rPr>
+              <w:t xml:space="preserve"> · כרטיסי-אבחון</w:t>
+            </w:r>
+          </w:p>
+        </w:tc>
+        <w:tc>
+          <w:tcPr>
+            <w:tcW w:type="dxa" w:w="4320"/>
+          </w:tcPr>
+          <w:p>
+            <w:pPr>
+              <w:bidi w:val="1"/>
+              <w:jc w:val="right"/>
+            </w:pPr>
+            <w:r>
+              <w:rPr>
+                <w:rFonts w:ascii="Consolas" w:hAnsi="Consolas"/>
+                <w:b w:val="0"/>
+                <w:color w:val="B02A37"/>
+                <w:sz w:val="20"/>
+                <w:rtl w:val="1"/>
+                <w:rFonts w:cs="Consolas"/>
+              </w:rPr>
+              <w:t>app/page.tsx</w:t>
+            </w:r>
+            <w:r>
+              <w:rPr>
+                <w:rFonts w:ascii="Arial" w:hAnsi="Arial"/>
+                <w:b w:val="0"/>
+                <w:sz w:val="20"/>
+                <w:rtl w:val="1"/>
+                <w:rFonts w:cs="Arial"/>
+              </w:rPr>
+              <w:t xml:space="preserve">, </w:t>
+            </w:r>
+            <w:r>
+              <w:rPr>
+                <w:rFonts w:ascii="Consolas" w:hAnsi="Consolas"/>
+                <w:b w:val="0"/>
+                <w:color w:val="B02A37"/>
+                <w:sz w:val="20"/>
+                <w:rtl w:val="1"/>
+                <w:rFonts w:cs="Consolas"/>
+              </w:rPr>
+              <w:t>components/Dashboard.tsx</w:t>
+            </w:r>
+          </w:p>
+        </w:tc>
+      </w:tr>
+      <w:tr>
+        <w:tc>
+          <w:tcPr>
+            <w:tcW w:type="dxa" w:w="4320"/>
+          </w:tcPr>
+          <w:p>
+            <w:pPr>
+              <w:bidi w:val="1"/>
+              <w:jc w:val="right"/>
+            </w:pPr>
+            <w:r>
+              <w:rPr>
+                <w:rFonts w:ascii="Arial" w:hAnsi="Arial"/>
+                <w:b/>
+                <w:sz w:val="20"/>
+                <w:rtl w:val="1"/>
+                <w:rFonts w:cs="Arial"/>
+              </w:rPr>
+              <w:t>בוט (טלגרם) + ערוצים</w:t>
+            </w:r>
+            <w:r>
+              <w:rPr>
+                <w:rFonts w:ascii="Arial" w:hAnsi="Arial"/>
+                <w:b w:val="0"/>
+                <w:sz w:val="20"/>
+                <w:rtl w:val="1"/>
+                <w:rFonts w:cs="Arial"/>
+              </w:rPr>
+              <w:t xml:space="preserve"> — אבחון על דרישה</w:t>
+            </w:r>
+          </w:p>
+        </w:tc>
+        <w:tc>
+          <w:tcPr>
+            <w:tcW w:type="dxa" w:w="4320"/>
+          </w:tcPr>
+          <w:p>
+            <w:pPr>
+              <w:bidi w:val="1"/>
+              <w:jc w:val="right"/>
+            </w:pPr>
+            <w:r>
+              <w:rPr>
+                <w:rFonts w:ascii="Consolas" w:hAnsi="Consolas"/>
+                <w:b w:val="0"/>
+                <w:color w:val="B02A37"/>
+                <w:sz w:val="20"/>
+                <w:rtl w:val="1"/>
+                <w:rFonts w:cs="Consolas"/>
+              </w:rPr>
+              <w:t>/api/bot</w:t>
+            </w:r>
+            <w:r>
+              <w:rPr>
+                <w:rFonts w:ascii="Arial" w:hAnsi="Arial"/>
+                <w:b w:val="0"/>
+                <w:sz w:val="20"/>
+                <w:rtl w:val="1"/>
+                <w:rFonts w:cs="Arial"/>
+              </w:rPr>
+              <w:t xml:space="preserve">, </w:t>
+            </w:r>
+            <w:r>
+              <w:rPr>
+                <w:rFonts w:ascii="Consolas" w:hAnsi="Consolas"/>
+                <w:b w:val="0"/>
+                <w:color w:val="B02A37"/>
+                <w:sz w:val="20"/>
+                <w:rtl w:val="1"/>
+                <w:rFonts w:cs="Consolas"/>
+              </w:rPr>
+              <w:t>lib/channels.ts</w:t>
+            </w:r>
+            <w:r>
+              <w:rPr>
+                <w:rFonts w:ascii="Arial" w:hAnsi="Arial"/>
+                <w:b w:val="0"/>
+                <w:sz w:val="20"/>
+                <w:rtl w:val="1"/>
+                <w:rFonts w:cs="Arial"/>
+              </w:rPr>
+              <w:t xml:space="preserve">, </w:t>
+            </w:r>
+            <w:r>
+              <w:rPr>
+                <w:rFonts w:ascii="Consolas" w:hAnsi="Consolas"/>
+                <w:b w:val="0"/>
+                <w:color w:val="B02A37"/>
+                <w:sz w:val="20"/>
+                <w:rtl w:val="1"/>
+                <w:rFonts w:cs="Consolas"/>
+              </w:rPr>
+              <w:t>bot_links</w:t>
+            </w:r>
+          </w:p>
+        </w:tc>
+      </w:tr>
+      <w:tr>
+        <w:tc>
+          <w:tcPr>
+            <w:tcW w:type="dxa" w:w="4320"/>
+          </w:tcPr>
+          <w:p>
+            <w:pPr>
+              <w:bidi w:val="1"/>
+              <w:jc w:val="right"/>
+            </w:pPr>
+            <w:r>
+              <w:rPr>
+                <w:rFonts w:ascii="Arial" w:hAnsi="Arial"/>
+                <w:b/>
+                <w:sz w:val="20"/>
+                <w:rtl w:val="1"/>
+                <w:rFonts w:cs="Arial"/>
+              </w:rPr>
+              <w:t>חיבור דשבורדים</w:t>
+            </w:r>
+            <w:r>
+              <w:rPr>
+                <w:rFonts w:ascii="Arial" w:hAnsi="Arial"/>
+                <w:b w:val="0"/>
+                <w:sz w:val="20"/>
+                <w:rtl w:val="1"/>
+                <w:rFonts w:cs="Arial"/>
+              </w:rPr>
+              <w:t xml:space="preserve"> — ייצוא מדדי CRO/retention</w:t>
+            </w:r>
+          </w:p>
+        </w:tc>
+        <w:tc>
+          <w:tcPr>
+            <w:tcW w:type="dxa" w:w="4320"/>
+          </w:tcPr>
+          <w:p>
+            <w:pPr>
+              <w:bidi w:val="1"/>
+              <w:jc w:val="right"/>
+            </w:pPr>
+            <w:r>
+              <w:rPr>
+                <w:rFonts w:ascii="Consolas" w:hAnsi="Consolas"/>
+                <w:b w:val="0"/>
+                <w:color w:val="B02A37"/>
+                <w:sz w:val="20"/>
+                <w:rtl w:val="1"/>
+                <w:rFonts w:cs="Consolas"/>
+              </w:rPr>
+              <w:t>/api/export/growth-metrics</w:t>
+            </w:r>
+            <w:r>
+              <w:rPr>
+                <w:rFonts w:ascii="Arial" w:hAnsi="Arial"/>
+                <w:b w:val="0"/>
+                <w:sz w:val="20"/>
+                <w:rtl w:val="1"/>
+                <w:rFonts w:cs="Arial"/>
+              </w:rPr>
+              <w:t xml:space="preserve"> (→ connector </w:t>
+            </w:r>
+            <w:r>
+              <w:rPr>
+                <w:rFonts w:ascii="Consolas" w:hAnsi="Consolas"/>
+                <w:b w:val="0"/>
+                <w:color w:val="B02A37"/>
+                <w:sz w:val="20"/>
+                <w:rtl w:val="1"/>
+                <w:rFonts w:cs="Consolas"/>
+              </w:rPr>
+              <w:t>helix_growth</w:t>
+            </w:r>
+            <w:r>
+              <w:rPr>
+                <w:rFonts w:ascii="Arial" w:hAnsi="Arial"/>
+                <w:b w:val="0"/>
+                <w:sz w:val="20"/>
+                <w:rtl w:val="1"/>
+                <w:rFonts w:cs="Arial"/>
+              </w:rPr>
+              <w:t>)</w:t>
+            </w:r>
+          </w:p>
+        </w:tc>
+      </w:tr>
+      <w:tr>
+        <w:tc>
+          <w:tcPr>
+            <w:tcW w:type="dxa" w:w="4320"/>
+          </w:tcPr>
+          <w:p>
+            <w:pPr>
+              <w:bidi w:val="1"/>
+              <w:jc w:val="right"/>
+            </w:pPr>
+            <w:r>
+              <w:rPr>
+                <w:rFonts w:ascii="Arial" w:hAnsi="Arial"/>
+                <w:b/>
+                <w:sz w:val="20"/>
+                <w:rtl w:val="1"/>
+                <w:rFonts w:cs="Arial"/>
+              </w:rPr>
+              <w:t>מודל נתונים + RLS</w:t>
+            </w:r>
+            <w:r>
+              <w:rPr>
+                <w:rFonts w:ascii="Arial" w:hAnsi="Arial"/>
+                <w:b w:val="0"/>
+                <w:sz w:val="20"/>
+                <w:rtl w:val="1"/>
+                <w:rFonts w:cs="Arial"/>
+              </w:rPr>
+              <w:t xml:space="preserve"> — events/funnels/insights/connections/bot_links + </w:t>
+            </w:r>
+            <w:r>
+              <w:rPr>
+                <w:rFonts w:ascii="Consolas" w:hAnsi="Consolas"/>
+                <w:b w:val="0"/>
+                <w:color w:val="B02A37"/>
+                <w:sz w:val="20"/>
+                <w:rtl w:val="1"/>
+                <w:rFonts w:cs="Consolas"/>
+              </w:rPr>
+              <w:t>create_workspace</w:t>
+            </w:r>
+          </w:p>
+        </w:tc>
+        <w:tc>
+          <w:tcPr>
+            <w:tcW w:type="dxa" w:w="4320"/>
+          </w:tcPr>
+          <w:p>
+            <w:pPr>
+              <w:bidi w:val="1"/>
+              <w:jc w:val="right"/>
+            </w:pPr>
+            <w:r>
+              <w:rPr>
+                <w:rFonts w:ascii="Consolas" w:hAnsi="Consolas"/>
+                <w:b w:val="0"/>
+                <w:color w:val="B02A37"/>
+                <w:sz w:val="20"/>
+                <w:rtl w:val="1"/>
+                <w:rFonts w:cs="Consolas"/>
+              </w:rPr>
+              <w:t>supabase/schema.sql</w:t>
+            </w:r>
+          </w:p>
+        </w:tc>
+      </w:tr>
+      <w:tr>
+        <w:tc>
+          <w:tcPr>
+            <w:tcW w:type="dxa" w:w="4320"/>
+          </w:tcPr>
+          <w:p>
+            <w:pPr>
+              <w:bidi w:val="1"/>
+              <w:jc w:val="right"/>
+            </w:pPr>
+            <w:r>
+              <w:rPr>
+                <w:rFonts w:ascii="Arial" w:hAnsi="Arial"/>
+                <w:b/>
+                <w:sz w:val="20"/>
+                <w:rtl w:val="1"/>
+                <w:rFonts w:cs="Arial"/>
+              </w:rPr>
+              <w:t>מפרט + ויזואל</w:t>
+            </w:r>
+            <w:r>
+              <w:rPr>
+                <w:rFonts w:ascii="Arial" w:hAnsi="Arial"/>
+                <w:b w:val="0"/>
+                <w:sz w:val="20"/>
+                <w:rtl w:val="1"/>
+                <w:rFonts w:cs="Arial"/>
+              </w:rPr>
+              <w:t xml:space="preserve"> — המסמך הזה + Artifact חי + README + .env.example</w:t>
+            </w:r>
+          </w:p>
+        </w:tc>
+        <w:tc>
+          <w:tcPr>
+            <w:tcW w:type="dxa" w:w="4320"/>
+          </w:tcPr>
+          <w:p>
+            <w:pPr>
+              <w:bidi w:val="1"/>
+              <w:jc w:val="right"/>
+            </w:pPr>
+            <w:r>
+              <w:rPr>
+                <w:rFonts w:ascii="Arial" w:hAnsi="Arial"/>
+                <w:b w:val="0"/>
+                <w:sz w:val="20"/>
+                <w:rtl w:val="1"/>
+                <w:rFonts w:cs="Arial"/>
+              </w:rPr>
+              <w:t>—</w:t>
+            </w:r>
+          </w:p>
+        </w:tc>
+      </w:tr>
+    </w:tbl>
     <w:p>
       <w:pPr>
         <w:pStyle w:val="Heading3"/>
@@ -6320,7 +7156,7 @@
           <w:rtl w:val="1"/>
           <w:rFonts w:cs="Arial"/>
         </w:rPr>
-        <w:t>⬜ מה נשאר להשלים (הכל — לפי סדר-הבנייה §10)</w:t>
+        <w:t>⬜ נשאר להשלים</w:t>
       </w:r>
     </w:p>
     <w:tbl>
@@ -6461,7 +7297,7 @@
                 <w:rtl w:val="1"/>
                 <w:rFonts w:cs="Arial"/>
               </w:rPr>
-              <w:t>סקאפולד אפליקציה</w:t>
+              <w:t>connector Microsoft Clarity</w:t>
             </w:r>
           </w:p>
         </w:tc>
@@ -6482,7 +7318,7 @@
                 <w:rtl w:val="1"/>
                 <w:rFonts w:cs="Arial"/>
               </w:rPr>
-              <w:t>טרם</w:t>
+              <w:t>לא נבנה</w:t>
             </w:r>
           </w:p>
         </w:tc>
@@ -6503,7 +7339,7 @@
                 <w:rtl w:val="1"/>
                 <w:rFonts w:cs="Arial"/>
               </w:rPr>
-              <w:t>Next.js 15 + TS + Tailwind + Supabase (RTL) בגיט הייעודי (בהמשך)</w:t>
+              <w:t>Clarity API (heatmaps/replay/funnels) — מקור חינם למפות-חום אמיתיות</w:t>
             </w:r>
           </w:p>
         </w:tc>
@@ -6547,7 +7383,7 @@
                 <w:rtl w:val="1"/>
                 <w:rFonts w:cs="Arial"/>
               </w:rPr>
-              <w:t>טאג-אירועים (HELIX tag)</w:t>
+              <w:t>connector GA4 / Mixpanel / PostHog</w:t>
             </w:r>
           </w:p>
         </w:tc>
@@ -6568,7 +7404,7 @@
                 <w:rtl w:val="1"/>
                 <w:rFonts w:cs="Arial"/>
               </w:rPr>
-              <w:t>טרם</w:t>
+              <w:t>לא נבנה</w:t>
             </w:r>
           </w:p>
         </w:tc>
@@ -6589,7 +7425,7 @@
                 <w:rtl w:val="1"/>
                 <w:rFonts w:cs="Arial"/>
               </w:rPr>
-              <w:t>snippet JS לאיסוף funnel-events + חזרות (first-party)</w:t>
+              <w:t>לשאוב funnel/retention מהמערכות הקיימות של הלקוח</w:t>
             </w:r>
           </w:p>
         </w:tc>
@@ -6633,7 +7469,7 @@
                 <w:rtl w:val="1"/>
                 <w:rFonts w:cs="Arial"/>
               </w:rPr>
-              <w:t>connector Microsoft Clarity</w:t>
+              <w:t>cohort/retention מ-real-data</w:t>
             </w:r>
           </w:p>
         </w:tc>
@@ -6654,7 +7490,7 @@
                 <w:rtl w:val="1"/>
                 <w:rFonts w:cs="Arial"/>
               </w:rPr>
-              <w:t>טרם</w:t>
+              <w:t>חלקי</w:t>
             </w:r>
           </w:p>
         </w:tc>
@@ -6675,7 +7511,28 @@
                 <w:rtl w:val="1"/>
                 <w:rFonts w:cs="Arial"/>
               </w:rPr>
-              <w:t>Clarity API (heatmaps/replay/funnels) — מקור חינם</w:t>
+              <w:t>כרגע demo; לחשב מ-events (</w:t>
+            </w:r>
+            <w:r>
+              <w:rPr>
+                <w:rFonts w:ascii="Consolas" w:hAnsi="Consolas"/>
+                <w:b w:val="0"/>
+                <w:color w:val="B02A37"/>
+                <w:sz w:val="20"/>
+                <w:rtl w:val="1"/>
+                <w:rFonts w:cs="Consolas"/>
+              </w:rPr>
+              <w:t>return</w:t>
+            </w:r>
+            <w:r>
+              <w:rPr>
+                <w:rFonts w:ascii="Arial" w:hAnsi="Arial"/>
+                <w:b w:val="0"/>
+                <w:sz w:val="20"/>
+                <w:rtl w:val="1"/>
+                <w:rFonts w:cs="Arial"/>
+              </w:rPr>
+              <w:t xml:space="preserve"> + timestamps)</w:t>
             </w:r>
           </w:p>
         </w:tc>
@@ -6719,7 +7576,7 @@
                 <w:rtl w:val="1"/>
                 <w:rFonts w:cs="Arial"/>
               </w:rPr>
-              <w:t>מנוע funnel drop-off</w:t>
+              <w:t>חיווט התיקון → HELIX OPS</w:t>
             </w:r>
           </w:p>
         </w:tc>
@@ -6740,7 +7597,7 @@
                 <w:rtl w:val="1"/>
                 <w:rFonts w:cs="Arial"/>
               </w:rPr>
-              <w:t>טרם</w:t>
+              <w:t>לא נבנה</w:t>
             </w:r>
           </w:p>
         </w:tc>
@@ -6761,7 +7618,7 @@
                 <w:rtl w:val="1"/>
                 <w:rFonts w:cs="Arial"/>
               </w:rPr>
-              <w:t>זיהוי נקודת-נשירה + ניתוח</w:t>
+              <w:t>כפתורי "תקן עכשיו" → קריאה בפועל ל-Landing/A-B/Campaigns של מוצר 1</w:t>
             </w:r>
           </w:p>
         </w:tc>
@@ -6805,7 +7662,7 @@
                 <w:rtl w:val="1"/>
                 <w:rFonts w:cs="Arial"/>
               </w:rPr>
-              <w:t>מנוע retention/cohort</w:t>
+              <w:t>בוט וואטסאפ/מייל נכנס</w:t>
             </w:r>
           </w:p>
         </w:tc>
@@ -6826,7 +7683,7 @@
                 <w:rtl w:val="1"/>
                 <w:rFonts w:cs="Arial"/>
               </w:rPr>
-              <w:t>טרם</w:t>
+              <w:t>חלקי</w:t>
             </w:r>
           </w:p>
         </w:tc>
@@ -6847,7 +7704,7 @@
                 <w:rtl w:val="1"/>
                 <w:rFonts w:cs="Arial"/>
               </w:rPr>
-              <w:t>retention curves + cohort heatmap</w:t>
+              <w:t>טלגרם בנוי; להצביע webhook וואטסאפ/מייל לאותו router</w:t>
             </w:r>
           </w:p>
         </w:tc>
@@ -6891,7 +7748,7 @@
                 <w:rtl w:val="1"/>
                 <w:rFonts w:cs="Arial"/>
               </w:rPr>
-              <w:t>סוכן Growth Doctor (Ollama)</w:t>
+              <w:t>לולאה אוטונומית</w:t>
             </w:r>
           </w:p>
         </w:tc>
@@ -6912,7 +7769,7 @@
                 <w:rtl w:val="1"/>
                 <w:rFonts w:cs="Arial"/>
               </w:rPr>
-              <w:t>טרם</w:t>
+              <w:t>לא נבנה</w:t>
             </w:r>
           </w:p>
         </w:tc>
@@ -6933,17 +7790,7 @@
                 <w:rtl w:val="1"/>
                 <w:rFonts w:cs="Arial"/>
               </w:rPr>
-              <w:t>תובנה→המלצה→</w:t>
-            </w:r>
-            <w:r>
-              <w:rPr>
-                <w:rFonts w:ascii="Arial" w:hAnsi="Arial"/>
-                <w:b/>
-                <w:sz w:val="20"/>
-                <w:rtl w:val="1"/>
-                <w:rFonts w:cs="Arial"/>
-              </w:rPr>
-              <w:t>חיווט ל-Landing/A-B/Campaigns</w:t>
+              <w:t>cron: measure→fix→re-measure</w:t>
             </w:r>
           </w:p>
         </w:tc>
@@ -6987,17 +7834,7 @@
                 <w:rtl w:val="1"/>
                 <w:rFonts w:cs="Arial"/>
               </w:rPr>
-              <w:t>מסכים</w:t>
-            </w:r>
-            <w:r>
-              <w:rPr>
-                <w:rFonts w:ascii="Arial" w:hAnsi="Arial"/>
-                <w:b w:val="0"/>
-                <w:sz w:val="20"/>
-                <w:rtl w:val="1"/>
-                <w:rFonts w:cs="Arial"/>
-              </w:rPr>
-              <w:t xml:space="preserve"> — Heatmap/Funnel/Cohort/Insights</w:t>
+              <w:t>auth/onboarding + Nav</w:t>
             </w:r>
           </w:p>
         </w:tc>
@@ -7018,7 +7855,7 @@
                 <w:rtl w:val="1"/>
                 <w:rFonts w:cs="Arial"/>
               </w:rPr>
-              <w:t>טרם</w:t>
+              <w:t>חלקי</w:t>
             </w:r>
           </w:p>
         </w:tc>
@@ -7039,7 +7876,7 @@
                 <w:rtl w:val="1"/>
                 <w:rFonts w:cs="Arial"/>
               </w:rPr>
-              <w:t>(הבסיס הוויזואלי קיים ב-Artifact)</w:t>
+              <w:t>login + הזנת HELIX tag למשתמש</w:t>
             </w:r>
           </w:p>
         </w:tc>
@@ -7083,7 +7920,7 @@
                 <w:rtl w:val="1"/>
                 <w:rFonts w:cs="Arial"/>
               </w:rPr>
-              <w:t>בוט מלא (וואטסאפ/טלגרם/מייל)</w:t>
+              <w:t>הרצה live</w:t>
             </w:r>
           </w:p>
         </w:tc>
@@ -7104,7 +7941,7 @@
                 <w:rtl w:val="1"/>
                 <w:rFonts w:cs="Arial"/>
               </w:rPr>
-              <w:t>טרם</w:t>
+              <w:t>קוד מוכן</w:t>
             </w:r>
           </w:p>
         </w:tc>
@@ -7125,7 +7962,7 @@
                 <w:rtl w:val="1"/>
                 <w:rFonts w:cs="Arial"/>
               </w:rPr>
-              <w:t xml:space="preserve">webhook </w:t>
+              <w:t xml:space="preserve">הרצת </w:t>
             </w:r>
             <w:r>
               <w:rPr>
@@ -7136,7 +7973,7 @@
                 <w:rtl w:val="1"/>
                 <w:rFonts w:cs="Consolas"/>
               </w:rPr>
-              <w:t>/api/bot</w:t>
+              <w:t>schema.sql</w:t>
             </w:r>
             <w:r>
               <w:rPr>
@@ -7146,7 +7983,112 @@
                 <w:rtl w:val="1"/>
                 <w:rFonts w:cs="Arial"/>
               </w:rPr>
-              <w:t xml:space="preserve"> + router (מודל HELIX OPS) — §3.5</w:t>
+              <w:t xml:space="preserve"> + env (</w:t>
+            </w:r>
+            <w:r>
+              <w:rPr>
+                <w:rFonts w:ascii="Consolas" w:hAnsi="Consolas"/>
+                <w:b w:val="0"/>
+                <w:color w:val="B02A37"/>
+                <w:sz w:val="20"/>
+                <w:rtl w:val="1"/>
+                <w:rFonts w:cs="Consolas"/>
+              </w:rPr>
+              <w:t>NEXT_PUBLIC_SUPABASE_*</w:t>
+            </w:r>
+            <w:r>
+              <w:rPr>
+                <w:rFonts w:ascii="Arial" w:hAnsi="Arial"/>
+                <w:b w:val="0"/>
+                <w:sz w:val="20"/>
+                <w:rtl w:val="1"/>
+                <w:rFonts w:cs="Arial"/>
+              </w:rPr>
+              <w:t xml:space="preserve">, </w:t>
+            </w:r>
+            <w:r>
+              <w:rPr>
+                <w:rFonts w:ascii="Consolas" w:hAnsi="Consolas"/>
+                <w:b w:val="0"/>
+                <w:color w:val="B02A37"/>
+                <w:sz w:val="20"/>
+                <w:rtl w:val="1"/>
+                <w:rFonts w:cs="Consolas"/>
+              </w:rPr>
+              <w:t>OLLAMA_BASE_URL</w:t>
+            </w:r>
+            <w:r>
+              <w:rPr>
+                <w:rFonts w:ascii="Arial" w:hAnsi="Arial"/>
+                <w:b w:val="0"/>
+                <w:sz w:val="20"/>
+                <w:rtl w:val="1"/>
+                <w:rFonts w:cs="Arial"/>
+              </w:rPr>
+              <w:t>/</w:t>
+            </w:r>
+            <w:r>
+              <w:rPr>
+                <w:rFonts w:ascii="Consolas" w:hAnsi="Consolas"/>
+                <w:b w:val="0"/>
+                <w:color w:val="B02A37"/>
+                <w:sz w:val="20"/>
+                <w:rtl w:val="1"/>
+                <w:rFonts w:cs="Consolas"/>
+              </w:rPr>
+              <w:t>ANTHROPIC_API_KEY</w:t>
+            </w:r>
+            <w:r>
+              <w:rPr>
+                <w:rFonts w:ascii="Arial" w:hAnsi="Arial"/>
+                <w:b w:val="0"/>
+                <w:sz w:val="20"/>
+                <w:rtl w:val="1"/>
+                <w:rFonts w:cs="Arial"/>
+              </w:rPr>
+              <w:t xml:space="preserve">, </w:t>
+            </w:r>
+            <w:r>
+              <w:rPr>
+                <w:rFonts w:ascii="Consolas" w:hAnsi="Consolas"/>
+                <w:b w:val="0"/>
+                <w:color w:val="B02A37"/>
+                <w:sz w:val="20"/>
+                <w:rtl w:val="1"/>
+                <w:rFonts w:cs="Consolas"/>
+              </w:rPr>
+              <w:t>TELEGRAM_BOT_TOKEN</w:t>
+            </w:r>
+            <w:r>
+              <w:rPr>
+                <w:rFonts w:ascii="Arial" w:hAnsi="Arial"/>
+                <w:b w:val="0"/>
+                <w:sz w:val="20"/>
+                <w:rtl w:val="1"/>
+                <w:rFonts w:cs="Arial"/>
+              </w:rPr>
+              <w:t xml:space="preserve">, </w:t>
+            </w:r>
+            <w:r>
+              <w:rPr>
+                <w:rFonts w:ascii="Consolas" w:hAnsi="Consolas"/>
+                <w:b w:val="0"/>
+                <w:color w:val="B02A37"/>
+                <w:sz w:val="20"/>
+                <w:rtl w:val="1"/>
+                <w:rFonts w:cs="Consolas"/>
+              </w:rPr>
+              <w:t>EXPORT_SECRET</w:t>
+            </w:r>
+            <w:r>
+              <w:rPr>
+                <w:rFonts w:ascii="Arial" w:hAnsi="Arial"/>
+                <w:b w:val="0"/>
+                <w:sz w:val="20"/>
+                <w:rtl w:val="1"/>
+                <w:rFonts w:cs="Arial"/>
+              </w:rPr>
+              <w:t>) + Deploy</w:t>
             </w:r>
           </w:p>
         </w:tc>
@@ -7170,210 +8112,6 @@
                 <w:rFonts w:cs="Arial"/>
               </w:rPr>
               <w:t>9</w:t>
-            </w:r>
-          </w:p>
-        </w:tc>
-        <w:tc>
-          <w:tcPr>
-            <w:tcW w:type="dxa" w:w="2160"/>
-          </w:tcPr>
-          <w:p>
-            <w:pPr>
-              <w:bidi w:val="1"/>
-              <w:jc w:val="right"/>
-            </w:pPr>
-            <w:r>
-              <w:rPr>
-                <w:rFonts w:ascii="Arial" w:hAnsi="Arial"/>
-                <w:b/>
-                <w:sz w:val="20"/>
-                <w:rtl w:val="1"/>
-                <w:rFonts w:cs="Arial"/>
-              </w:rPr>
-              <w:t>חיבור דשבורדים</w:t>
-            </w:r>
-          </w:p>
-        </w:tc>
-        <w:tc>
-          <w:tcPr>
-            <w:tcW w:type="dxa" w:w="2160"/>
-          </w:tcPr>
-          <w:p>
-            <w:pPr>
-              <w:bidi w:val="1"/>
-              <w:jc w:val="right"/>
-            </w:pPr>
-            <w:r>
-              <w:rPr>
-                <w:rFonts w:ascii="Arial" w:hAnsi="Arial"/>
-                <w:b w:val="0"/>
-                <w:sz w:val="20"/>
-                <w:rtl w:val="1"/>
-                <w:rFonts w:cs="Arial"/>
-              </w:rPr>
-              <w:t>טרם</w:t>
-            </w:r>
-          </w:p>
-        </w:tc>
-        <w:tc>
-          <w:tcPr>
-            <w:tcW w:type="dxa" w:w="2160"/>
-          </w:tcPr>
-          <w:p>
-            <w:pPr>
-              <w:bidi w:val="1"/>
-              <w:jc w:val="right"/>
-            </w:pPr>
-            <w:r>
-              <w:rPr>
-                <w:rFonts w:ascii="Consolas" w:hAnsi="Consolas"/>
-                <w:b w:val="0"/>
-                <w:color w:val="B02A37"/>
-                <w:sz w:val="20"/>
-                <w:rtl w:val="1"/>
-                <w:rFonts w:cs="Consolas"/>
-              </w:rPr>
-              <w:t>/api/export/growth-metrics</w:t>
-            </w:r>
-            <w:r>
-              <w:rPr>
-                <w:rFonts w:ascii="Arial" w:hAnsi="Arial"/>
-                <w:b w:val="0"/>
-                <w:sz w:val="20"/>
-                <w:rtl w:val="1"/>
-                <w:rFonts w:cs="Arial"/>
-              </w:rPr>
-              <w:t xml:space="preserve"> + connector </w:t>
-            </w:r>
-            <w:r>
-              <w:rPr>
-                <w:rFonts w:ascii="Consolas" w:hAnsi="Consolas"/>
-                <w:b w:val="0"/>
-                <w:color w:val="B02A37"/>
-                <w:sz w:val="20"/>
-                <w:rtl w:val="1"/>
-                <w:rFonts w:cs="Consolas"/>
-              </w:rPr>
-              <w:t>helix_growth</w:t>
-            </w:r>
-            <w:r>
-              <w:rPr>
-                <w:rFonts w:ascii="Arial" w:hAnsi="Arial"/>
-                <w:b w:val="0"/>
-                <w:sz w:val="20"/>
-                <w:rtl w:val="1"/>
-                <w:rFonts w:cs="Arial"/>
-              </w:rPr>
-              <w:t xml:space="preserve"> — §3.5</w:t>
-            </w:r>
-          </w:p>
-        </w:tc>
-      </w:tr>
-      <w:tr>
-        <w:tc>
-          <w:tcPr>
-            <w:tcW w:type="dxa" w:w="2160"/>
-          </w:tcPr>
-          <w:p>
-            <w:pPr>
-              <w:bidi w:val="1"/>
-              <w:jc w:val="right"/>
-            </w:pPr>
-            <w:r>
-              <w:rPr>
-                <w:rFonts w:ascii="Arial" w:hAnsi="Arial"/>
-                <w:b w:val="0"/>
-                <w:sz w:val="20"/>
-                <w:rtl w:val="1"/>
-                <w:rFonts w:cs="Arial"/>
-              </w:rPr>
-              <w:t>10</w:t>
-            </w:r>
-          </w:p>
-        </w:tc>
-        <w:tc>
-          <w:tcPr>
-            <w:tcW w:type="dxa" w:w="2160"/>
-          </w:tcPr>
-          <w:p>
-            <w:pPr>
-              <w:bidi w:val="1"/>
-              <w:jc w:val="right"/>
-            </w:pPr>
-            <w:r>
-              <w:rPr>
-                <w:rFonts w:ascii="Arial" w:hAnsi="Arial"/>
-                <w:b/>
-                <w:sz w:val="20"/>
-                <w:rtl w:val="1"/>
-                <w:rFonts w:cs="Arial"/>
-              </w:rPr>
-              <w:t>לולאה אוטונומית</w:t>
-            </w:r>
-          </w:p>
-        </w:tc>
-        <w:tc>
-          <w:tcPr>
-            <w:tcW w:type="dxa" w:w="2160"/>
-          </w:tcPr>
-          <w:p>
-            <w:pPr>
-              <w:bidi w:val="1"/>
-              <w:jc w:val="right"/>
-            </w:pPr>
-            <w:r>
-              <w:rPr>
-                <w:rFonts w:ascii="Arial" w:hAnsi="Arial"/>
-                <w:b w:val="0"/>
-                <w:sz w:val="20"/>
-                <w:rtl w:val="1"/>
-                <w:rFonts w:cs="Arial"/>
-              </w:rPr>
-              <w:t>טרם</w:t>
-            </w:r>
-          </w:p>
-        </w:tc>
-        <w:tc>
-          <w:tcPr>
-            <w:tcW w:type="dxa" w:w="2160"/>
-          </w:tcPr>
-          <w:p>
-            <w:pPr>
-              <w:bidi w:val="1"/>
-              <w:jc w:val="right"/>
-            </w:pPr>
-            <w:r>
-              <w:rPr>
-                <w:rFonts w:ascii="Arial" w:hAnsi="Arial"/>
-                <w:b w:val="0"/>
-                <w:sz w:val="20"/>
-                <w:rtl w:val="1"/>
-                <w:rFonts w:cs="Arial"/>
-              </w:rPr>
-              <w:t>measure→fix→re-measure (cron)</w:t>
-            </w:r>
-          </w:p>
-        </w:tc>
-      </w:tr>
-      <w:tr>
-        <w:tc>
-          <w:tcPr>
-            <w:tcW w:type="dxa" w:w="2160"/>
-          </w:tcPr>
-          <w:p>
-            <w:pPr>
-              <w:bidi w:val="1"/>
-              <w:jc w:val="right"/>
-            </w:pPr>
-            <w:r>
-              <w:rPr>
-                <w:rFonts w:ascii="Arial" w:hAnsi="Arial"/>
-                <w:b w:val="0"/>
-                <w:sz w:val="20"/>
-                <w:rtl w:val="1"/>
-                <w:rFonts w:cs="Arial"/>
-              </w:rPr>
-              <w:t>11</w:t>
             </w:r>
           </w:p>
         </w:tc>
@@ -7430,16 +8168,6 @@
             </w:pPr>
             <w:r>
               <w:rPr>
-                <w:rFonts w:ascii="Arial" w:hAnsi="Arial"/>
-                <w:b w:val="0"/>
-                <w:sz w:val="20"/>
-                <w:rtl w:val="1"/>
-                <w:rFonts w:cs="Arial"/>
-              </w:rPr>
-              <w:t xml:space="preserve">ראה </w:t>
-            </w:r>
-            <w:r>
-              <w:rPr>
                 <w:rFonts w:ascii="Consolas" w:hAnsi="Consolas"/>
                 <w:b w:val="0"/>
                 <w:color w:val="B02A37"/>
@@ -7463,6 +8191,62 @@
         </w:tc>
       </w:tr>
     </w:tbl>
+    <w:p>
+      <w:pPr>
+        <w:bidi w:val="1"/>
+        <w:jc w:val="right"/>
+      </w:pPr>
+      <w:r>
+        <w:rPr>
+          <w:rFonts w:ascii="Arial" w:hAnsi="Arial"/>
+          <w:b/>
+          <w:sz w:val="22"/>
+          <w:rtl w:val="1"/>
+          <w:rFonts w:cs="Arial"/>
+        </w:rPr>
+        <w:t>המצב:</w:t>
+      </w:r>
+      <w:r>
+        <w:rPr>
+          <w:rFonts w:ascii="Arial" w:hAnsi="Arial"/>
+          <w:b w:val="0"/>
+          <w:sz w:val="22"/>
+          <w:rtl w:val="1"/>
+          <w:rFonts w:cs="Arial"/>
+        </w:rPr>
+        <w:t xml:space="preserve"> הליבה — </w:t>
+      </w:r>
+      <w:r>
+        <w:rPr>
+          <w:rFonts w:ascii="Arial" w:hAnsi="Arial"/>
+          <w:b/>
+          <w:sz w:val="22"/>
+          <w:rtl w:val="1"/>
+          <w:rFonts w:cs="Arial"/>
+        </w:rPr>
+        <w:t>מנוע-אירועים + funnel + cohort + סוכן-אבחון + דשבורד-ויזואלי + Ollama + בוט + ייצוא-דשבורדים</w:t>
+      </w:r>
+      <w:r>
+        <w:rPr>
+          <w:rFonts w:ascii="Arial" w:hAnsi="Arial"/>
+          <w:b w:val="0"/>
+          <w:sz w:val="22"/>
+          <w:rtl w:val="1"/>
+          <w:rFonts w:cs="Arial"/>
+        </w:rPr>
+        <w:t xml:space="preserve"> — נבנתה end-to-end. מה שנשאר בעיקר: </w:t>
+      </w:r>
+      <w:r>
+        <w:rPr>
+          <w:rFonts w:ascii="Arial" w:hAnsi="Arial"/>
+          <w:b/>
+          <w:sz w:val="22"/>
+          <w:rtl w:val="1"/>
+          <w:rFonts w:cs="Arial"/>
+        </w:rPr>
+        <w:t>connectors (Clarity/GA4), cohort real-data, חיווט התיקון ל-HELIX OPS, והרצה live.</w:t>
+      </w:r>
+    </w:p>
     <w:p>
       <w:pPr>
         <w:bidi w:val="1"/>

</xml_diff>

<commit_message>
docs(growth-doctor): reflect autonomy switch across product page + specs + xlsx
- products-data.ts: new "מתג אוטונומיה" feature + control/safety FAQ
- 07-growth-doctor.docx: new autonomy-layer section
- HELIX SOFTWARES REVIEW PAGES.docx: growth-doctor autonomy note
- HELIX-external-connections.xlsx: autonomy_settings status row (run autonomy.sql)

Co-Authored-By: Claude Opus 4.8 (1M context) <noreply@anthropic.com>
</commit_message>
<xml_diff>
--- a/PRODUCTS/07-growth-doctor.docx
+++ b/PRODUCTS/07-growth-doctor.docx
@@ -8432,6 +8432,24 @@
         <w:t>להגדרה (env/Meta, לא קוד): להגדיר את ה-verify-token, לרשום את ה-webhook ב-Meta עם subscription ל-messages, ולוודא credentials של וואטסאפ. חובה מספר בפורמט בינלאומי מלא — 050… לא יתאים ל-wa_id.</w:t>
       </w:r>
     </w:p>
+    <w:p>
+      <w:r>
+        <w:t>---</w:t>
+      </w:r>
+    </w:p>
+    <w:p>
+      <w:pPr>
+        <w:pStyle w:val="Heading2"/>
+      </w:pPr>
+      <w:r>
+        <w:t>שכבת אוטונומיה — מתג המלץ / אשר / אוטופיילוט (2026-08)</w:t>
+      </w:r>
+    </w:p>
+    <w:p>
+      <w:r>
+        <w:t>הפעולות של ה-Doctor (תיקון דף, A/B, קמפיין, win-back) עברו ממצב "רק מציג" למתג אוטונומיה אחיד ב-3 מצבים לכל סוג פעולה: 💡 יועץ (רק ממליץ) · 📩 מאשר (מכין פעולה ושולח לאישור המשתמש בלוח הבקרה + התראה בערוץ) · 🤖 אוטופיילוט (מבצע ומדווח). ברירת מחדל בטוחה = יועץ; פעולות outbound/רגישות דורשות risk_ack מפורש אחרת המערכת מורידה אוטומטית ל'מאשר'. המצב נפתר בצד השרת לפי feature_key — הלקוח אינו יכול לכפות ביצוע. תשתית: autonomy_settings + autonomy_actions (supabase/autonomy.sql). מבטל את כפתורי ה-CTA המדומים הקודמים שלא ביצעו פעולה בפועל.</w:t>
+      </w:r>
+    </w:p>
     <w:sectPr>
       <w:pgSz w:w="12240" w:h="15840"/>
       <w:pgMar w:top="1440" w:right="1800" w:bottom="1440" w:left="1800" w:header="720" w:footer="720" w:gutter="0"/>

</xml_diff>